<commit_message>
Update resume and portfolio career timeline
</commit_message>
<xml_diff>
--- a/assets/resume/gabriel-wu-resume.docx
+++ b/assets/resume/gabriel-wu-resume.docx
@@ -136,7 +136,7 @@
           <w:color w:val="22282D"/>
           <w:sz w:val="20"/>
         </w:rPr>
-        <w:t>Splunk / SIEM engineer with 15+ years in enterprise IT operations and hands-on administration of Splunk Enterprise in government environments. Translates security monitoring and audit requirements into data onboarding, SPL dashboards, alerts, scheduled reporting, retention controls, and evidence workflows. Combines RHEL/Windows platform operations with Python, Bash, and PowerShell automation and cross-team delivery.</w:t>
+        <w:t>Splunk / SIEM engineer with 16+ years of IT experience across school ICT support and enterprise infrastructure operations. Hands-on administration of Splunk Enterprise in government environments, translating security monitoring and audit requirements into data onboarding, SPL dashboards, alerts, scheduled reporting, retention controls, and evidence workflows. Combines RHEL/Windows platform operations with Python, Bash, and PowerShell automation and cross-team delivery.</w:t>
       </w:r>
     </w:p>
     <w:p>
@@ -270,7 +270,7 @@
           <w:color w:val="22282D"/>
           <w:sz w:val="20"/>
         </w:rPr>
-        <w:t>Splunk Enterprise Certified Admin | Splunk | 2026 | Active</w:t>
+        <w:t>Splunk Enterprise Certified Admin | 2026</w:t>
       </w:r>
     </w:p>
     <w:p>
@@ -286,7 +286,7 @@
           <w:color w:val="22282D"/>
           <w:sz w:val="20"/>
         </w:rPr>
-        <w:t>Splunk Core Certified Power User | Splunk | 2025 | Active</w:t>
+        <w:t>Splunk Core Certified Power User | 2025</w:t>
       </w:r>
     </w:p>
     <w:p>
@@ -640,6 +640,69 @@
     </w:p>
     <w:p>
       <w:pPr>
+        <w:keepNext/>
+        <w:spacing w:before="60" w:after="0"/>
+      </w:pPr>
+      <w:r>
+        <w:rPr>
+          <w:rFonts w:ascii="Calibri" w:hAnsi="Calibri"/>
+          <w:b/>
+          <w:color w:val="14364A"/>
+          <w:sz w:val="22"/>
+        </w:rPr>
+        <w:t>SSOE IT Support Engineer, MOE SSOE Project</w:t>
+      </w:r>
+    </w:p>
+    <w:p>
+      <w:pPr>
+        <w:keepNext/>
+        <w:spacing w:after="60"/>
+      </w:pPr>
+      <w:r>
+        <w:rPr>
+          <w:rFonts w:ascii="Calibri" w:hAnsi="Calibri"/>
+          <w:b/>
+          <w:color w:val="525D65"/>
+          <w:sz w:val="19"/>
+        </w:rPr>
+        <w:t>NCS | Singapore | June 2010 - January 2014</w:t>
+      </w:r>
+    </w:p>
+    <w:p>
+      <w:pPr>
+        <w:pStyle w:val="ListBullet"/>
+        <w:widowControl/>
+        <w:spacing w:before="0" w:after="66" w:line="257" w:lineRule="auto"/>
+        <w:ind w:left="288" w:hanging="202"/>
+      </w:pPr>
+      <w:r>
+        <w:rPr>
+          <w:rFonts w:ascii="Calibri" w:hAnsi="Calibri"/>
+          <w:color w:val="22282D"/>
+          <w:sz w:val="20"/>
+        </w:rPr>
+        <w:t>Provided school ICT and desktop support, troubleshooting end-user hardware and software issues and handling support tickets.</w:t>
+      </w:r>
+    </w:p>
+    <w:p>
+      <w:pPr>
+        <w:pStyle w:val="ListBullet"/>
+        <w:keepNext w:val="0"/>
+        <w:widowControl/>
+        <w:spacing w:before="0" w:after="66" w:line="257" w:lineRule="auto"/>
+        <w:ind w:left="288" w:hanging="202"/>
+      </w:pPr>
+      <w:r>
+        <w:rPr>
+          <w:rFonts w:ascii="Calibri" w:hAnsi="Calibri"/>
+          <w:color w:val="22282D"/>
+          <w:sz w:val="20"/>
+        </w:rPr>
+        <w:t>Installed and patched software, maintained IT asset inventory, and coordinated with vendors on repairs and replacements.</w:t>
+      </w:r>
+    </w:p>
+    <w:p>
+      <w:pPr>
         <w:pStyle w:val="ResumeSection"/>
         <w:keepNext/>
       </w:pPr>

</xml_diff>

<commit_message>
Restore resume PDF wording and date alignment
</commit_message>
<xml_diff>
--- a/assets/resume/gabriel-wu-resume.docx
+++ b/assets/resume/gabriel-wu-resume.docx
@@ -4,682 +4,1198 @@
   <w:body>
     <w:p>
       <w:pPr>
-        <w:spacing w:before="0" w:after="0"/>
+        <w:pStyle w:val="Title"/>
+        <w:spacing w:after="40"/>
       </w:pPr>
       <w:r>
         <w:rPr>
-          <w:rFonts w:ascii="Calibri" w:hAnsi="Calibri"/>
+          <w:rFonts w:ascii="Aptos" w:hAnsi="Aptos"/>
           <w:b/>
-          <w:color w:val="14364A"/>
-          <w:sz w:val="46"/>
+          <w:color w:val="123040"/>
+          <w:sz w:val="48"/>
         </w:rPr>
-        <w:t>GABRIEL WU</w:t>
+        <w:t>Gabriel Wu</w:t>
       </w:r>
     </w:p>
     <w:p>
       <w:pPr>
-        <w:spacing w:before="0" w:after="40"/>
+        <w:spacing w:after="160"/>
       </w:pPr>
       <w:r>
         <w:rPr>
-          <w:rFonts w:ascii="Calibri" w:hAnsi="Calibri"/>
-          <w:b/>
-          <w:color w:val="227D91"/>
-          <w:sz w:val="22"/>
+          <w:rFonts w:ascii="Aptos" w:hAnsi="Aptos"/>
+          <w:b w:val="0"/>
+          <w:color w:val="4C565E"/>
+          <w:sz w:val="18"/>
         </w:rPr>
-        <w:t>SPLUNK / SIEM ENGINEER | PLATFORM OPERATIONS &amp; AUTOMATION</w:t>
+        <w:t>Singapore  |  (+65) 9228 6005  |  twotwozero2@gmail.com  |  LinkedIn  |  2202labs.github.io</w:t>
       </w:r>
     </w:p>
     <w:p>
       <w:pPr>
-        <w:spacing w:after="100" w:line="240" w:lineRule="auto"/>
-      </w:pPr>
-      <w:r>
-        <w:rPr>
-          <w:rFonts w:ascii="Calibri" w:hAnsi="Calibri"/>
-          <w:color w:val="525D65"/>
-          <w:sz w:val="18"/>
-        </w:rPr>
-        <w:t xml:space="preserve">Singapore  |  </w:t>
-      </w:r>
-      <w:hyperlink r:id="rId10">
-        <w:r>
-          <w:rPr>
-            <w:rFonts w:ascii="Calibri" w:hAnsi="Calibri"/>
-            <w:color w:val="14668C"/>
-            <w:u w:val="single"/>
-            <w:sz w:val="18"/>
-          </w:rPr>
-          <w:t>Email</w:t>
-        </w:r>
-      </w:hyperlink>
-      <w:r>
-        <w:rPr>
-          <w:rFonts w:ascii="Calibri" w:hAnsi="Calibri"/>
-          <w:color w:val="525D65"/>
-          <w:sz w:val="18"/>
-        </w:rPr>
-        <w:t xml:space="preserve">  |  </w:t>
-      </w:r>
-      <w:hyperlink r:id="rId11">
-        <w:r>
-          <w:rPr>
-            <w:rFonts w:ascii="Calibri" w:hAnsi="Calibri"/>
-            <w:color w:val="14668C"/>
-            <w:u w:val="single"/>
-            <w:sz w:val="18"/>
-          </w:rPr>
-          <w:t>LinkedIn</w:t>
-        </w:r>
-      </w:hyperlink>
-      <w:r>
-        <w:rPr>
-          <w:rFonts w:ascii="Calibri" w:hAnsi="Calibri"/>
-          <w:color w:val="525D65"/>
-          <w:sz w:val="18"/>
-        </w:rPr>
-        <w:t xml:space="preserve">  |  </w:t>
-      </w:r>
-      <w:hyperlink r:id="rId12">
-        <w:r>
-          <w:rPr>
-            <w:rFonts w:ascii="Calibri" w:hAnsi="Calibri"/>
-            <w:color w:val="14668C"/>
-            <w:u w:val="single"/>
-            <w:sz w:val="18"/>
-          </w:rPr>
-          <w:t>Portfolio</w:t>
-        </w:r>
-      </w:hyperlink>
-      <w:r>
-        <w:rPr>
-          <w:rFonts w:ascii="Calibri" w:hAnsi="Calibri"/>
-          <w:color w:val="525D65"/>
-          <w:sz w:val="18"/>
-        </w:rPr>
-        <w:t xml:space="preserve">  |  </w:t>
-      </w:r>
-      <w:hyperlink r:id="rId13">
-        <w:r>
-          <w:rPr>
-            <w:rFonts w:ascii="Calibri" w:hAnsi="Calibri"/>
-            <w:color w:val="14668C"/>
-            <w:u w:val="single"/>
-            <w:sz w:val="18"/>
-          </w:rPr>
-          <w:t>GitHub</w:t>
-        </w:r>
-      </w:hyperlink>
-    </w:p>
-    <w:p>
-      <w:pPr>
-        <w:pStyle w:val="ResumeSection"/>
+        <w:pStyle w:val="Heading1"/>
         <w:keepNext/>
       </w:pPr>
       <w:r>
-        <w:rPr>
-          <w:rFonts w:ascii="Calibri" w:hAnsi="Calibri"/>
-          <w:b/>
-          <w:color w:val="227D91"/>
-          <w:sz w:val="21"/>
-        </w:rPr>
-        <w:t>PROFESSIONAL SUMMARY</w:t>
+        <w:t>Professional Summary</w:t>
       </w:r>
     </w:p>
     <w:p>
       <w:pPr>
-        <w:spacing w:after="60" w:line="259" w:lineRule="auto"/>
+        <w:spacing w:after="100"/>
       </w:pPr>
       <w:r>
         <w:rPr>
-          <w:rFonts w:ascii="Calibri" w:hAnsi="Calibri"/>
-          <w:color w:val="22282D"/>
-          <w:sz w:val="20"/>
+          <w:rFonts w:ascii="Aptos" w:hAnsi="Aptos"/>
+          <w:b w:val="0"/>
         </w:rPr>
-        <w:t>Splunk / SIEM engineer with 16+ years of IT experience across school ICT support and enterprise infrastructure operations. Hands-on administration of Splunk Enterprise in government environments, translating security monitoring and audit requirements into data onboarding, SPL dashboards, alerts, scheduled reporting, retention controls, and evidence workflows. Combines RHEL/Windows platform operations with Python, Bash, and PowerShell automation and cross-team delivery.</w:t>
+        <w:t>Infrastructure and observability engineer with 16+ years of IT experience across school ICT support and enterprise infrastructure operations. Currently supports multiple government project teams through Splunk platform governance, log onboarding and lifecycle management, dashboards and reporting, ingestion and search troubleshooting, and Python/Bash automation. Brings strong enterprise infrastructure and logging foundations with a focused progression toward observability, platform reliability and site reliability engineering.</w:t>
       </w:r>
     </w:p>
     <w:p>
       <w:pPr>
-        <w:pStyle w:val="ResumeSection"/>
+        <w:pStyle w:val="Heading1"/>
         <w:keepNext/>
       </w:pPr>
       <w:r>
-        <w:rPr>
-          <w:rFonts w:ascii="Calibri" w:hAnsi="Calibri"/>
-          <w:b/>
-          <w:color w:val="227D91"/>
-          <w:sz w:val="21"/>
-        </w:rPr>
-        <w:t>CORE EXPERTISE</w:t>
-      </w:r>
-    </w:p>
-    <w:p>
-      <w:pPr>
-        <w:spacing w:after="60" w:line="254" w:lineRule="auto"/>
-      </w:pPr>
-      <w:r>
-        <w:rPr>
-          <w:rFonts w:ascii="Calibri" w:hAnsi="Calibri"/>
-          <w:b/>
-          <w:color w:val="14364A"/>
-          <w:sz w:val="19"/>
-        </w:rPr>
-        <w:t xml:space="preserve">Splunk &amp; SIEM: </w:t>
-      </w:r>
-      <w:r>
-        <w:rPr>
-          <w:rFonts w:ascii="Calibri" w:hAnsi="Calibri"/>
-          <w:color w:val="22282D"/>
-          <w:sz w:val="19"/>
-        </w:rPr>
-        <w:t>Splunk Enterprise administration; SPL search optimisation; dashboards, alerts, scheduled reports</w:t>
-      </w:r>
-    </w:p>
-    <w:p>
-      <w:pPr>
-        <w:spacing w:after="60" w:line="254" w:lineRule="auto"/>
-      </w:pPr>
-      <w:r>
-        <w:rPr>
-          <w:rFonts w:ascii="Calibri" w:hAnsi="Calibri"/>
-          <w:b/>
-          <w:color w:val="14364A"/>
-          <w:sz w:val="19"/>
-        </w:rPr>
-        <w:t xml:space="preserve">Log Engineering: </w:t>
-      </w:r>
-      <w:r>
-        <w:rPr>
-          <w:rFonts w:ascii="Calibri" w:hAnsi="Calibri"/>
-          <w:color w:val="22282D"/>
-          <w:sz w:val="19"/>
-        </w:rPr>
-        <w:t>Data onboarding; ingestion troubleshooting; retention; parsing, field extraction, and normalisation coordination</w:t>
-      </w:r>
-    </w:p>
-    <w:p>
-      <w:pPr>
-        <w:spacing w:after="60" w:line="254" w:lineRule="auto"/>
-      </w:pPr>
-      <w:r>
-        <w:rPr>
-          <w:rFonts w:ascii="Calibri" w:hAnsi="Calibri"/>
-          <w:b/>
-          <w:color w:val="14364A"/>
-          <w:sz w:val="19"/>
-        </w:rPr>
-        <w:t xml:space="preserve">Security Operations: </w:t>
-      </w:r>
-      <w:r>
-        <w:rPr>
-          <w:rFonts w:ascii="Calibri" w:hAnsi="Calibri"/>
-          <w:color w:val="22282D"/>
-          <w:sz w:val="19"/>
-        </w:rPr>
-        <w:t>Log analysis; investigation support; audit evidence; compliance reporting; security reviews</w:t>
-      </w:r>
-    </w:p>
-    <w:p>
-      <w:pPr>
-        <w:spacing w:after="60" w:line="254" w:lineRule="auto"/>
-      </w:pPr>
-      <w:r>
-        <w:rPr>
-          <w:rFonts w:ascii="Calibri" w:hAnsi="Calibri"/>
-          <w:b/>
-          <w:color w:val="14364A"/>
-          <w:sz w:val="19"/>
-        </w:rPr>
-        <w:t xml:space="preserve">Platforms &amp; Automation: </w:t>
-      </w:r>
-      <w:r>
-        <w:rPr>
-          <w:rFonts w:ascii="Calibri" w:hAnsi="Calibri"/>
-          <w:color w:val="22282D"/>
-          <w:sz w:val="19"/>
-        </w:rPr>
-        <w:t>RHEL and Windows Server hardening, patching, vulnerability remediation; Python, Bash, and PowerShell</w:t>
-      </w:r>
-    </w:p>
-    <w:p>
-      <w:pPr>
-        <w:pStyle w:val="ResumeSection"/>
-        <w:keepNext/>
-      </w:pPr>
-      <w:r>
-        <w:rPr>
-          <w:rFonts w:ascii="Calibri" w:hAnsi="Calibri"/>
-          <w:b/>
-          <w:color w:val="227D91"/>
-          <w:sz w:val="21"/>
-        </w:rPr>
-        <w:t>CERTIFICATIONS</w:t>
+        <w:t>Core Skills</w:t>
       </w:r>
     </w:p>
     <w:p>
       <w:pPr>
         <w:pStyle w:val="ListBullet"/>
-        <w:widowControl/>
-        <w:spacing w:before="0" w:after="66" w:line="257" w:lineRule="auto"/>
-        <w:ind w:left="288" w:hanging="202"/>
       </w:pPr>
       <w:r>
         <w:rPr>
-          <w:rFonts w:ascii="Calibri" w:hAnsi="Calibri"/>
-          <w:color w:val="22282D"/>
-          <w:sz w:val="20"/>
+          <w:rFonts w:ascii="Aptos" w:hAnsi="Aptos"/>
+          <w:b/>
         </w:rPr>
-        <w:t>Splunk Enterprise Certified Admin | 2026</w:t>
+        <w:t xml:space="preserve">Observability &amp; Logging: </w:t>
+      </w:r>
+      <w:r>
+        <w:rPr>
+          <w:rFonts w:ascii="Aptos" w:hAnsi="Aptos"/>
+          <w:b w:val="0"/>
+        </w:rPr>
+        <w:t>Splunk Enterprise administration, log onboarding &amp; retention, security logging use cases, log analysis &amp; troubleshooting, dashboards &amp; scheduled reporting</w:t>
       </w:r>
     </w:p>
     <w:p>
       <w:pPr>
         <w:pStyle w:val="ListBullet"/>
-        <w:widowControl/>
-        <w:spacing w:before="0" w:after="66" w:line="257" w:lineRule="auto"/>
-        <w:ind w:left="288" w:hanging="202"/>
       </w:pPr>
       <w:r>
         <w:rPr>
-          <w:rFonts w:ascii="Calibri" w:hAnsi="Calibri"/>
-          <w:color w:val="22282D"/>
-          <w:sz w:val="20"/>
+          <w:rFonts w:ascii="Aptos" w:hAnsi="Aptos"/>
+          <w:b/>
         </w:rPr>
-        <w:t>Splunk Core Certified Power User | 2025</w:t>
+        <w:t xml:space="preserve">Infrastructure: </w:t>
       </w:r>
-    </w:p>
-    <w:p>
-      <w:pPr>
-        <w:pStyle w:val="ResumeSection"/>
-        <w:keepNext/>
-      </w:pPr>
       <w:r>
         <w:rPr>
-          <w:rFonts w:ascii="Calibri" w:hAnsi="Calibri"/>
-          <w:b/>
-          <w:color w:val="227D91"/>
-          <w:sz w:val="21"/>
+          <w:rFonts w:ascii="Aptos" w:hAnsi="Aptos"/>
+          <w:b w:val="0"/>
         </w:rPr>
-        <w:t>PROFESSIONAL EXPERIENCE</w:t>
-      </w:r>
-    </w:p>
-    <w:p>
-      <w:pPr>
-        <w:keepNext/>
-        <w:spacing w:before="60" w:after="0"/>
-      </w:pPr>
-      <w:r>
-        <w:rPr>
-          <w:rFonts w:ascii="Calibri" w:hAnsi="Calibri"/>
-          <w:b/>
-          <w:color w:val="14364A"/>
-          <w:sz w:val="22"/>
-        </w:rPr>
-        <w:t>Cybersecurity / Splunk Engineer (Seconded to DSTA client site)</w:t>
-      </w:r>
-    </w:p>
-    <w:p>
-      <w:pPr>
-        <w:keepNext/>
-        <w:spacing w:after="60"/>
-      </w:pPr>
-      <w:r>
-        <w:rPr>
-          <w:rFonts w:ascii="Calibri" w:hAnsi="Calibri"/>
-          <w:b/>
-          <w:color w:val="525D65"/>
-          <w:sz w:val="19"/>
-        </w:rPr>
-        <w:t>NCS Pte Ltd | Singapore | Sep 2022 - Present</w:t>
+        <w:t>Red Hat Enterprise Linux (RHEL), Windows Server, Hyper-V, Nutanix, patching &amp; vulnerability remediation, disaster recovery &amp; system hardening</w:t>
       </w:r>
     </w:p>
     <w:p>
       <w:pPr>
         <w:pStyle w:val="ListBullet"/>
-        <w:widowControl/>
-        <w:spacing w:before="0" w:after="66" w:line="257" w:lineRule="auto"/>
-        <w:ind w:left="288" w:hanging="202"/>
       </w:pPr>
       <w:r>
         <w:rPr>
-          <w:rFonts w:ascii="Calibri" w:hAnsi="Calibri"/>
-          <w:color w:val="22282D"/>
-          <w:sz w:val="20"/>
+          <w:rFonts w:ascii="Aptos" w:hAnsi="Aptos"/>
+          <w:b/>
         </w:rPr>
-        <w:t>Administer and govern Splunk Enterprise for multiple government project teams, supporting secure and scalable logging and SIEM operations.</w:t>
+        <w:t xml:space="preserve">Automation &amp; Data: </w:t>
+      </w:r>
+      <w:r>
+        <w:rPr>
+          <w:rFonts w:ascii="Aptos" w:hAnsi="Aptos"/>
+          <w:b w:val="0"/>
+        </w:rPr>
+        <w:t>Python, Bash, operational automation, data lifecycle management, reporting automation</w:t>
       </w:r>
     </w:p>
     <w:p>
       <w:pPr>
         <w:pStyle w:val="ListBullet"/>
-        <w:widowControl/>
-        <w:spacing w:before="0" w:after="66" w:line="257" w:lineRule="auto"/>
-        <w:ind w:left="288" w:hanging="202"/>
       </w:pPr>
       <w:r>
         <w:rPr>
-          <w:rFonts w:ascii="Calibri" w:hAnsi="Calibri"/>
-          <w:color w:val="22282D"/>
-          <w:sz w:val="20"/>
+          <w:rFonts w:ascii="Aptos" w:hAnsi="Aptos"/>
+          <w:b/>
         </w:rPr>
-        <w:t>Designed and implemented six security logging use cases, with SPL dashboards and reports supporting monitoring, security reviews, and audit evidence.</w:t>
+        <w:t xml:space="preserve">Reliability &amp; Operations: </w:t>
+      </w:r>
+      <w:r>
+        <w:rPr>
+          <w:rFonts w:ascii="Aptos" w:hAnsi="Aptos"/>
+          <w:b w:val="0"/>
+        </w:rPr>
+        <w:t>Production troubleshooting, root-cause analysis, monitoring, platform health, incident support, capacity support</w:t>
       </w:r>
     </w:p>
     <w:p>
       <w:pPr>
         <w:pStyle w:val="ListBullet"/>
-        <w:widowControl/>
-        <w:spacing w:before="0" w:after="66" w:line="257" w:lineRule="auto"/>
-        <w:ind w:left="288" w:hanging="202"/>
       </w:pPr>
       <w:r>
         <w:rPr>
-          <w:rFonts w:ascii="Calibri" w:hAnsi="Calibri"/>
-          <w:color w:val="22282D"/>
-          <w:sz w:val="20"/>
+          <w:rFonts w:ascii="Aptos" w:hAnsi="Aptos"/>
+          <w:b/>
         </w:rPr>
-        <w:t>Led end-to-end onboarding of data sources, aligning ingestion, retention, and operational requirements with stakeholder needs.</w:t>
+        <w:t xml:space="preserve">Delivery: </w:t>
+      </w:r>
+      <w:r>
+        <w:rPr>
+          <w:rFonts w:ascii="Aptos" w:hAnsi="Aptos"/>
+          <w:b w:val="0"/>
+        </w:rPr>
+        <w:t>Stakeholder collaboration, technical documentation, cross-team operational support, regulated government environments</w:t>
+      </w:r>
+    </w:p>
+    <w:p>
+      <w:pPr>
+        <w:pStyle w:val="Heading1"/>
+        <w:keepNext/>
+      </w:pPr>
+      <w:r>
+        <w:t>Experience</w:t>
+      </w:r>
+    </w:p>
+    <w:tbl>
+      <w:tblPr>
+        <w:tblW w:type="auto" w:w="0"/>
+        <w:jc w:val="center"/>
+        <w:tblLayout w:type="fixed"/>
+        <w:tblLook w:firstColumn="1" w:firstRow="1" w:lastColumn="0" w:lastRow="0" w:noHBand="0" w:noVBand="1" w:val="04A0"/>
+        <w:tblBorders>
+          <w:top w:val="nil"/>
+          <w:left w:val="nil"/>
+          <w:bottom w:val="nil"/>
+          <w:right w:val="nil"/>
+          <w:insideH w:val="nil"/>
+          <w:insideV w:val="nil"/>
+        </w:tblBorders>
+        <w:tblCellMar>
+          <w:top w:w="0" w:type="dxa"/>
+          <w:start w:w="0" w:type="dxa"/>
+          <w:bottom w:w="0" w:type="dxa"/>
+          <w:end w:w="0" w:type="dxa"/>
+        </w:tblCellMar>
+      </w:tblPr>
+      <w:tblGrid>
+        <w:gridCol w:w="7272"/>
+        <w:gridCol w:w="1944"/>
+      </w:tblGrid>
+      <w:tr>
+        <w:tc>
+          <w:tcPr>
+            <w:tcW w:type="dxa" w:w="7272"/>
+            <w:vAlign w:val="center"/>
+          </w:tcPr>
+          <w:p>
+            <w:pPr>
+              <w:keepNext/>
+              <w:spacing w:before="40" w:after="0"/>
+            </w:pPr>
+            <w:r>
+              <w:rPr>
+                <w:rFonts w:ascii="Aptos" w:hAnsi="Aptos"/>
+                <w:b/>
+                <w:sz w:val="18"/>
+              </w:rPr>
+              <w:t>NCS Pte Ltd</w:t>
+            </w:r>
+          </w:p>
+        </w:tc>
+        <w:tc>
+          <w:tcPr>
+            <w:tcW w:type="dxa" w:w="1944"/>
+            <w:vAlign w:val="center"/>
+          </w:tcPr>
+          <w:p>
+            <w:pPr>
+              <w:keepNext/>
+              <w:spacing w:before="40" w:after="0"/>
+              <w:jc w:val="right"/>
+            </w:pPr>
+            <w:r>
+              <w:rPr>
+                <w:rFonts w:ascii="Aptos" w:hAnsi="Aptos"/>
+                <w:b w:val="0"/>
+                <w:color w:val="4C565E"/>
+                <w:sz w:val="18"/>
+              </w:rPr>
+              <w:t>Sep 2022 - Present</w:t>
+            </w:r>
+          </w:p>
+        </w:tc>
+      </w:tr>
+    </w:tbl>
+    <w:tbl>
+      <w:tblPr>
+        <w:tblW w:type="auto" w:w="0"/>
+        <w:jc w:val="center"/>
+        <w:tblLayout w:type="fixed"/>
+        <w:tblLook w:firstColumn="1" w:firstRow="1" w:lastColumn="0" w:lastRow="0" w:noHBand="0" w:noVBand="1" w:val="04A0"/>
+        <w:tblBorders>
+          <w:top w:val="nil"/>
+          <w:left w:val="nil"/>
+          <w:bottom w:val="nil"/>
+          <w:right w:val="nil"/>
+          <w:insideH w:val="nil"/>
+          <w:insideV w:val="nil"/>
+        </w:tblBorders>
+        <w:tblCellMar>
+          <w:top w:w="0" w:type="dxa"/>
+          <w:start w:w="0" w:type="dxa"/>
+          <w:bottom w:w="0" w:type="dxa"/>
+          <w:end w:w="0" w:type="dxa"/>
+        </w:tblCellMar>
+      </w:tblPr>
+      <w:tblGrid>
+        <w:gridCol w:w="7272"/>
+        <w:gridCol w:w="1944"/>
+      </w:tblGrid>
+      <w:tr>
+        <w:tc>
+          <w:tcPr>
+            <w:tcW w:type="dxa" w:w="7272"/>
+            <w:vAlign w:val="center"/>
+          </w:tcPr>
+          <w:p>
+            <w:pPr>
+              <w:keepNext/>
+              <w:spacing w:before="0" w:after="20"/>
+            </w:pPr>
+            <w:r>
+              <w:rPr>
+                <w:rFonts w:ascii="Aptos" w:hAnsi="Aptos"/>
+                <w:b/>
+                <w:sz w:val="18"/>
+              </w:rPr>
+              <w:t>Cybersecurity / Splunk Engineer (Seconded to DSTA client site)</w:t>
+            </w:r>
+          </w:p>
+        </w:tc>
+        <w:tc>
+          <w:tcPr>
+            <w:tcW w:type="dxa" w:w="1944"/>
+            <w:vAlign w:val="center"/>
+          </w:tcPr>
+          <w:p>
+            <w:pPr>
+              <w:keepNext/>
+              <w:spacing w:before="0" w:after="20"/>
+              <w:jc w:val="right"/>
+            </w:pPr>
+            <w:r>
+              <w:rPr>
+                <w:rFonts w:ascii="Aptos" w:hAnsi="Aptos"/>
+                <w:b w:val="0"/>
+                <w:color w:val="4C565E"/>
+                <w:sz w:val="18"/>
+              </w:rPr>
+              <w:t>Singapore</w:t>
+            </w:r>
+          </w:p>
+        </w:tc>
+      </w:tr>
+    </w:tbl>
+    <w:p>
+      <w:pPr>
+        <w:pStyle w:val="ListBullet"/>
+        <w:keepNext/>
+      </w:pPr>
+      <w:r>
+        <w:rPr>
+          <w:rFonts w:ascii="Aptos" w:hAnsi="Aptos"/>
+          <w:b w:val="0"/>
+        </w:rPr>
+        <w:t>Seconded to DSTA as an NCS client resource; rotated across Cybersecurity and Infrastructure teams while maintaining a consistent Splunk engineering, security logging and platform-operations scope.</w:t>
       </w:r>
     </w:p>
     <w:p>
       <w:pPr>
         <w:pStyle w:val="ListBullet"/>
-        <w:widowControl/>
-        <w:spacing w:before="0" w:after="66" w:line="257" w:lineRule="auto"/>
-        <w:ind w:left="288" w:hanging="202"/>
+        <w:keepNext/>
       </w:pPr>
       <w:r>
         <w:rPr>
-          <w:rFonts w:ascii="Calibri" w:hAnsi="Calibri"/>
-          <w:color w:val="22282D"/>
-          <w:sz w:val="20"/>
+          <w:rFonts w:ascii="Aptos" w:hAnsi="Aptos"/>
+          <w:b w:val="0"/>
         </w:rPr>
-        <w:t>Troubleshoot ingestion and search issues across technical teams, improving data quality, search usability, and day-to-day supportability.</w:t>
+        <w:t>Govern Splunk Enterprise logging and platform operations for multiple government project teams, supporting platform stability, security visibility and audit readiness.</w:t>
       </w:r>
     </w:p>
     <w:p>
       <w:pPr>
         <w:pStyle w:val="ListBullet"/>
-        <w:widowControl/>
-        <w:spacing w:before="0" w:after="66" w:line="257" w:lineRule="auto"/>
-        <w:ind w:left="288" w:hanging="202"/>
+        <w:keepNext/>
       </w:pPr>
       <w:r>
         <w:rPr>
-          <w:rFonts w:ascii="Calibri" w:hAnsi="Calibri"/>
-          <w:color w:val="22282D"/>
-          <w:sz w:val="20"/>
+          <w:rFonts w:ascii="Aptos" w:hAnsi="Aptos"/>
+          <w:b w:val="0"/>
         </w:rPr>
-        <w:t>Support security operations and investigations through log analysis, evidence extraction, and compliance reporting.</w:t>
+        <w:t>Implemented 6 security logging use cases and standardised dashboards and reports to strengthen operational visibility and support security reviews and compliance audits.</w:t>
       </w:r>
     </w:p>
     <w:p>
       <w:pPr>
         <w:pStyle w:val="ListBullet"/>
-        <w:widowControl/>
-        <w:spacing w:before="0" w:after="66" w:line="257" w:lineRule="auto"/>
-        <w:ind w:left="288" w:hanging="202"/>
+        <w:keepNext/>
       </w:pPr>
       <w:r>
         <w:rPr>
-          <w:rFonts w:ascii="Calibri" w:hAnsi="Calibri"/>
-          <w:color w:val="22282D"/>
-          <w:sz w:val="20"/>
+          <w:rFonts w:ascii="Aptos" w:hAnsi="Aptos"/>
+          <w:b w:val="0"/>
         </w:rPr>
-        <w:t>Automate recurring compliance checks and data-management tasks with Python, Bash, and PowerShell to reduce manual follow-up.</w:t>
+        <w:t>Deliver end-to-end log onboarding and lifecycle management aligned to ingestion, retention, search and reporting requirements.</w:t>
       </w:r>
     </w:p>
     <w:p>
       <w:pPr>
         <w:pStyle w:val="ListBullet"/>
-        <w:widowControl/>
-        <w:spacing w:before="0" w:after="66" w:line="257" w:lineRule="auto"/>
-        <w:ind w:left="288" w:hanging="202"/>
+        <w:keepNext/>
       </w:pPr>
       <w:r>
         <w:rPr>
-          <w:rFonts w:ascii="Calibri" w:hAnsi="Calibri"/>
-          <w:color w:val="22282D"/>
-          <w:sz w:val="20"/>
+          <w:rFonts w:ascii="Aptos" w:hAnsi="Aptos"/>
+          <w:b w:val="0"/>
         </w:rPr>
-        <w:t>Maintain Splunk components and underlying RHEL servers through patching, vulnerability remediation, and system hardening.</w:t>
-      </w:r>
-    </w:p>
-    <w:p>
-      <w:r>
-        <w:br w:type="page"/>
-      </w:r>
-    </w:p>
-    <w:p>
-      <w:pPr>
-        <w:keepNext/>
-        <w:spacing w:before="60" w:after="0"/>
-      </w:pPr>
-      <w:r>
-        <w:rPr>
-          <w:rFonts w:ascii="Calibri" w:hAnsi="Calibri"/>
-          <w:b/>
-          <w:color w:val="14364A"/>
-          <w:sz w:val="22"/>
-        </w:rPr>
-        <w:t>Wintel Engineer</w:t>
-      </w:r>
-    </w:p>
-    <w:p>
-      <w:pPr>
-        <w:keepNext/>
-        <w:spacing w:after="60"/>
-      </w:pPr>
-      <w:r>
-        <w:rPr>
-          <w:rFonts w:ascii="Calibri" w:hAnsi="Calibri"/>
-          <w:b/>
-          <w:color w:val="525D65"/>
-          <w:sz w:val="19"/>
-        </w:rPr>
-        <w:t>NCS Pte Ltd | Singapore | Nov 2018 - Aug 2022</w:t>
+        <w:t>Collaborate with stakeholders to define logging requirements and troubleshoot ingestion, search and platform issues using log evidence and infrastructure context.</w:t>
       </w:r>
     </w:p>
     <w:p>
       <w:pPr>
         <w:pStyle w:val="ListBullet"/>
-        <w:widowControl/>
-        <w:spacing w:before="0" w:after="66" w:line="257" w:lineRule="auto"/>
-        <w:ind w:left="288" w:hanging="202"/>
+        <w:keepNext/>
       </w:pPr>
       <w:r>
         <w:rPr>
-          <w:rFonts w:ascii="Calibri" w:hAnsi="Calibri"/>
-          <w:color w:val="22282D"/>
-          <w:sz w:val="20"/>
+          <w:rFonts w:ascii="Aptos" w:hAnsi="Aptos"/>
+          <w:b w:val="0"/>
         </w:rPr>
-        <w:t>Managed Windows Server, Hyper-V, and Nutanix environments supporting enterprise availability, security, and performance requirements.</w:t>
+        <w:t>Automate recurring compliance checks and data-management tasks using Python and Bash, reducing manual operational effort and turnaround time.</w:t>
       </w:r>
     </w:p>
     <w:p>
       <w:pPr>
         <w:pStyle w:val="ListBullet"/>
-        <w:widowControl/>
-        <w:spacing w:before="0" w:after="66" w:line="257" w:lineRule="auto"/>
-        <w:ind w:left="288" w:hanging="202"/>
+        <w:keepNext w:val="0"/>
       </w:pPr>
       <w:r>
         <w:rPr>
-          <w:rFonts w:ascii="Calibri" w:hAnsi="Calibri"/>
-          <w:color w:val="22282D"/>
-          <w:sz w:val="20"/>
+          <w:rFonts w:ascii="Aptos" w:hAnsi="Aptos"/>
+          <w:b w:val="0"/>
         </w:rPr>
-        <w:t>Executed patching and vulnerability-remediation programmes and supported disaster-recovery planning and testing.</w:t>
+        <w:t>Maintain Splunk components and underlying RHEL servers through patching, vulnerability assessment and remediation, and system hardening.</w:t>
+      </w:r>
+    </w:p>
+    <w:tbl>
+      <w:tblPr>
+        <w:tblW w:type="auto" w:w="0"/>
+        <w:jc w:val="center"/>
+        <w:tblLayout w:type="fixed"/>
+        <w:tblLook w:firstColumn="1" w:firstRow="1" w:lastColumn="0" w:lastRow="0" w:noHBand="0" w:noVBand="1" w:val="04A0"/>
+        <w:tblBorders>
+          <w:top w:val="nil"/>
+          <w:left w:val="nil"/>
+          <w:bottom w:val="nil"/>
+          <w:right w:val="nil"/>
+          <w:insideH w:val="nil"/>
+          <w:insideV w:val="nil"/>
+        </w:tblBorders>
+        <w:tblCellMar>
+          <w:top w:w="0" w:type="dxa"/>
+          <w:start w:w="0" w:type="dxa"/>
+          <w:bottom w:w="0" w:type="dxa"/>
+          <w:end w:w="0" w:type="dxa"/>
+        </w:tblCellMar>
+      </w:tblPr>
+      <w:tblGrid>
+        <w:gridCol w:w="7272"/>
+        <w:gridCol w:w="1944"/>
+      </w:tblGrid>
+      <w:tr>
+        <w:tc>
+          <w:tcPr>
+            <w:tcW w:type="dxa" w:w="7272"/>
+            <w:vAlign w:val="center"/>
+          </w:tcPr>
+          <w:p>
+            <w:pPr>
+              <w:keepNext/>
+              <w:spacing w:before="40" w:after="0"/>
+            </w:pPr>
+            <w:r>
+              <w:rPr>
+                <w:rFonts w:ascii="Aptos" w:hAnsi="Aptos"/>
+                <w:b/>
+                <w:sz w:val="18"/>
+              </w:rPr>
+              <w:t>NCS Pte Ltd</w:t>
+            </w:r>
+          </w:p>
+        </w:tc>
+        <w:tc>
+          <w:tcPr>
+            <w:tcW w:type="dxa" w:w="1944"/>
+            <w:vAlign w:val="center"/>
+          </w:tcPr>
+          <w:p>
+            <w:pPr>
+              <w:keepNext/>
+              <w:spacing w:before="40" w:after="0"/>
+              <w:jc w:val="right"/>
+            </w:pPr>
+            <w:r>
+              <w:rPr>
+                <w:rFonts w:ascii="Aptos" w:hAnsi="Aptos"/>
+                <w:b w:val="0"/>
+                <w:color w:val="4C565E"/>
+                <w:sz w:val="18"/>
+              </w:rPr>
+              <w:t>Nov 2018 - Aug 2022</w:t>
+            </w:r>
+          </w:p>
+        </w:tc>
+      </w:tr>
+    </w:tbl>
+    <w:tbl>
+      <w:tblPr>
+        <w:tblW w:type="auto" w:w="0"/>
+        <w:jc w:val="center"/>
+        <w:tblLayout w:type="fixed"/>
+        <w:tblLook w:firstColumn="1" w:firstRow="1" w:lastColumn="0" w:lastRow="0" w:noHBand="0" w:noVBand="1" w:val="04A0"/>
+        <w:tblBorders>
+          <w:top w:val="nil"/>
+          <w:left w:val="nil"/>
+          <w:bottom w:val="nil"/>
+          <w:right w:val="nil"/>
+          <w:insideH w:val="nil"/>
+          <w:insideV w:val="nil"/>
+        </w:tblBorders>
+        <w:tblCellMar>
+          <w:top w:w="0" w:type="dxa"/>
+          <w:start w:w="0" w:type="dxa"/>
+          <w:bottom w:w="0" w:type="dxa"/>
+          <w:end w:w="0" w:type="dxa"/>
+        </w:tblCellMar>
+      </w:tblPr>
+      <w:tblGrid>
+        <w:gridCol w:w="7272"/>
+        <w:gridCol w:w="1944"/>
+      </w:tblGrid>
+      <w:tr>
+        <w:tc>
+          <w:tcPr>
+            <w:tcW w:type="dxa" w:w="7272"/>
+            <w:vAlign w:val="center"/>
+          </w:tcPr>
+          <w:p>
+            <w:pPr>
+              <w:keepNext/>
+              <w:spacing w:before="0" w:after="20"/>
+            </w:pPr>
+            <w:r>
+              <w:rPr>
+                <w:rFonts w:ascii="Aptos" w:hAnsi="Aptos"/>
+                <w:b/>
+                <w:sz w:val="18"/>
+              </w:rPr>
+              <w:t>Wintel Engineer</w:t>
+            </w:r>
+          </w:p>
+        </w:tc>
+        <w:tc>
+          <w:tcPr>
+            <w:tcW w:type="dxa" w:w="1944"/>
+            <w:vAlign w:val="center"/>
+          </w:tcPr>
+          <w:p>
+            <w:pPr>
+              <w:keepNext/>
+              <w:spacing w:before="0" w:after="20"/>
+              <w:jc w:val="right"/>
+            </w:pPr>
+            <w:r>
+              <w:rPr>
+                <w:rFonts w:ascii="Aptos" w:hAnsi="Aptos"/>
+                <w:b w:val="0"/>
+                <w:color w:val="4C565E"/>
+                <w:sz w:val="18"/>
+              </w:rPr>
+              <w:t>Singapore</w:t>
+            </w:r>
+          </w:p>
+        </w:tc>
+      </w:tr>
+    </w:tbl>
+    <w:p>
+      <w:pPr>
+        <w:pStyle w:val="ListBullet"/>
+        <w:keepNext/>
+      </w:pPr>
+      <w:r>
+        <w:rPr>
+          <w:rFonts w:ascii="Aptos" w:hAnsi="Aptos"/>
+          <w:b w:val="0"/>
+        </w:rPr>
+        <w:t>Administered Windows Server, Hyper-V and Nutanix environments to meet enterprise availability, security and performance requirements.</w:t>
       </w:r>
     </w:p>
     <w:p>
       <w:pPr>
         <w:pStyle w:val="ListBullet"/>
-        <w:widowControl/>
-        <w:spacing w:before="0" w:after="66" w:line="257" w:lineRule="auto"/>
-        <w:ind w:left="288" w:hanging="202"/>
+        <w:keepNext/>
       </w:pPr>
       <w:r>
         <w:rPr>
-          <w:rFonts w:ascii="Calibri" w:hAnsi="Calibri"/>
-          <w:color w:val="22282D"/>
-          <w:sz w:val="20"/>
+          <w:rFonts w:ascii="Aptos" w:hAnsi="Aptos"/>
+          <w:b w:val="0"/>
         </w:rPr>
-        <w:t>Monitored platform health, resolved complex infrastructure issues, and delivered upgrades and operational support.</w:t>
-      </w:r>
-    </w:p>
-    <w:p>
-      <w:pPr>
-        <w:keepNext/>
-        <w:spacing w:before="60" w:after="0"/>
-      </w:pPr>
-      <w:r>
-        <w:rPr>
-          <w:rFonts w:ascii="Calibri" w:hAnsi="Calibri"/>
-          <w:b/>
-          <w:color w:val="14364A"/>
-          <w:sz w:val="22"/>
-        </w:rPr>
-        <w:t>Systems Engineer</w:t>
-      </w:r>
-    </w:p>
-    <w:p>
-      <w:pPr>
-        <w:keepNext/>
-        <w:spacing w:after="60"/>
-      </w:pPr>
-      <w:r>
-        <w:rPr>
-          <w:rFonts w:ascii="Calibri" w:hAnsi="Calibri"/>
-          <w:b/>
-          <w:color w:val="525D65"/>
-          <w:sz w:val="19"/>
-        </w:rPr>
-        <w:t>ST Electronics (Info-comm Systems) Pte Ltd | Singapore | May 2016 - Oct 2018</w:t>
+        <w:t>Executed patching and vulnerability-remediation programmes and supported disaster-recovery planning and testing to strengthen infrastructure resilience.</w:t>
       </w:r>
     </w:p>
     <w:p>
       <w:pPr>
         <w:pStyle w:val="ListBullet"/>
-        <w:widowControl/>
-        <w:spacing w:before="0" w:after="66" w:line="257" w:lineRule="auto"/>
-        <w:ind w:left="288" w:hanging="202"/>
+        <w:keepNext w:val="0"/>
       </w:pPr>
       <w:r>
         <w:rPr>
-          <w:rFonts w:ascii="Calibri" w:hAnsi="Calibri"/>
-          <w:color w:val="22282D"/>
-          <w:sz w:val="20"/>
+          <w:rFonts w:ascii="Aptos" w:hAnsi="Aptos"/>
+          <w:b w:val="0"/>
         </w:rPr>
-        <w:t>Provided L1/L2 infrastructure and network support, including server administration, patching, monitoring, and operational reporting.</w:t>
+        <w:t>Monitored server health, diagnosed infrastructure issues and delivered capacity upgrades to support evolving project demands.</w:t>
+      </w:r>
+    </w:p>
+    <w:tbl>
+      <w:tblPr>
+        <w:tblW w:type="auto" w:w="0"/>
+        <w:jc w:val="center"/>
+        <w:tblLayout w:type="fixed"/>
+        <w:tblLook w:firstColumn="1" w:firstRow="1" w:lastColumn="0" w:lastRow="0" w:noHBand="0" w:noVBand="1" w:val="04A0"/>
+        <w:tblBorders>
+          <w:top w:val="nil"/>
+          <w:left w:val="nil"/>
+          <w:bottom w:val="nil"/>
+          <w:right w:val="nil"/>
+          <w:insideH w:val="nil"/>
+          <w:insideV w:val="nil"/>
+        </w:tblBorders>
+        <w:tblCellMar>
+          <w:top w:w="0" w:type="dxa"/>
+          <w:start w:w="0" w:type="dxa"/>
+          <w:bottom w:w="0" w:type="dxa"/>
+          <w:end w:w="0" w:type="dxa"/>
+        </w:tblCellMar>
+      </w:tblPr>
+      <w:tblGrid>
+        <w:gridCol w:w="7272"/>
+        <w:gridCol w:w="1944"/>
+      </w:tblGrid>
+      <w:tr>
+        <w:tc>
+          <w:tcPr>
+            <w:tcW w:type="dxa" w:w="7272"/>
+            <w:vAlign w:val="center"/>
+          </w:tcPr>
+          <w:p>
+            <w:pPr>
+              <w:keepNext/>
+              <w:spacing w:before="40" w:after="0"/>
+            </w:pPr>
+            <w:r>
+              <w:rPr>
+                <w:rFonts w:ascii="Aptos" w:hAnsi="Aptos"/>
+                <w:b/>
+                <w:sz w:val="18"/>
+              </w:rPr>
+              <w:t>ST Electronics (Info-comm Systems) Pte Ltd</w:t>
+            </w:r>
+          </w:p>
+        </w:tc>
+        <w:tc>
+          <w:tcPr>
+            <w:tcW w:type="dxa" w:w="1944"/>
+            <w:vAlign w:val="center"/>
+          </w:tcPr>
+          <w:p>
+            <w:pPr>
+              <w:keepNext/>
+              <w:spacing w:before="40" w:after="0"/>
+              <w:jc w:val="right"/>
+            </w:pPr>
+            <w:r>
+              <w:rPr>
+                <w:rFonts w:ascii="Aptos" w:hAnsi="Aptos"/>
+                <w:b w:val="0"/>
+                <w:color w:val="4C565E"/>
+                <w:sz w:val="18"/>
+              </w:rPr>
+              <w:t>May 2016 - Oct 2018</w:t>
+            </w:r>
+          </w:p>
+        </w:tc>
+      </w:tr>
+    </w:tbl>
+    <w:tbl>
+      <w:tblPr>
+        <w:tblW w:type="auto" w:w="0"/>
+        <w:jc w:val="center"/>
+        <w:tblLayout w:type="fixed"/>
+        <w:tblLook w:firstColumn="1" w:firstRow="1" w:lastColumn="0" w:lastRow="0" w:noHBand="0" w:noVBand="1" w:val="04A0"/>
+        <w:tblBorders>
+          <w:top w:val="nil"/>
+          <w:left w:val="nil"/>
+          <w:bottom w:val="nil"/>
+          <w:right w:val="nil"/>
+          <w:insideH w:val="nil"/>
+          <w:insideV w:val="nil"/>
+        </w:tblBorders>
+        <w:tblCellMar>
+          <w:top w:w="0" w:type="dxa"/>
+          <w:start w:w="0" w:type="dxa"/>
+          <w:bottom w:w="0" w:type="dxa"/>
+          <w:end w:w="0" w:type="dxa"/>
+        </w:tblCellMar>
+      </w:tblPr>
+      <w:tblGrid>
+        <w:gridCol w:w="7272"/>
+        <w:gridCol w:w="1944"/>
+      </w:tblGrid>
+      <w:tr>
+        <w:tc>
+          <w:tcPr>
+            <w:tcW w:type="dxa" w:w="7272"/>
+            <w:vAlign w:val="center"/>
+          </w:tcPr>
+          <w:p>
+            <w:pPr>
+              <w:keepNext/>
+              <w:spacing w:before="0" w:after="20"/>
+            </w:pPr>
+            <w:r>
+              <w:rPr>
+                <w:rFonts w:ascii="Aptos" w:hAnsi="Aptos"/>
+                <w:b/>
+                <w:sz w:val="18"/>
+              </w:rPr>
+              <w:t>Systems Engineer</w:t>
+            </w:r>
+          </w:p>
+        </w:tc>
+        <w:tc>
+          <w:tcPr>
+            <w:tcW w:type="dxa" w:w="1944"/>
+            <w:vAlign w:val="center"/>
+          </w:tcPr>
+          <w:p>
+            <w:pPr>
+              <w:keepNext/>
+              <w:spacing w:before="0" w:after="20"/>
+              <w:jc w:val="right"/>
+            </w:pPr>
+            <w:r>
+              <w:rPr>
+                <w:rFonts w:ascii="Aptos" w:hAnsi="Aptos"/>
+                <w:b w:val="0"/>
+                <w:color w:val="4C565E"/>
+                <w:sz w:val="18"/>
+              </w:rPr>
+              <w:t>Singapore</w:t>
+            </w:r>
+          </w:p>
+        </w:tc>
+      </w:tr>
+    </w:tbl>
+    <w:p>
+      <w:pPr>
+        <w:pStyle w:val="ListBullet"/>
+        <w:keepNext/>
+      </w:pPr>
+      <w:r>
+        <w:rPr>
+          <w:rFonts w:ascii="Aptos" w:hAnsi="Aptos"/>
+          <w:b w:val="0"/>
+        </w:rPr>
+        <w:t>Delivered L1/L2 infrastructure and network support across server administration, patching, monitoring and operational reporting.</w:t>
       </w:r>
     </w:p>
     <w:p>
       <w:pPr>
         <w:pStyle w:val="ListBullet"/>
-        <w:widowControl/>
-        <w:spacing w:before="0" w:after="66" w:line="257" w:lineRule="auto"/>
-        <w:ind w:left="288" w:hanging="202"/>
+        <w:keepNext w:val="0"/>
       </w:pPr>
       <w:r>
         <w:rPr>
-          <w:rFonts w:ascii="Calibri" w:hAnsi="Calibri"/>
-          <w:color w:val="22282D"/>
-          <w:sz w:val="20"/>
+          <w:rFonts w:ascii="Aptos" w:hAnsi="Aptos"/>
+          <w:b w:val="0"/>
         </w:rPr>
-        <w:t>Performed troubleshooting and root-cause analysis across hardware, software, and network/security components.</w:t>
+        <w:t>Performed troubleshooting and root-cause analysis across hardware, software and network/security components to restore service and support stable operations.</w:t>
       </w:r>
     </w:p>
+    <w:tbl>
+      <w:tblPr>
+        <w:tblW w:type="auto" w:w="0"/>
+        <w:jc w:val="center"/>
+        <w:tblLayout w:type="fixed"/>
+        <w:tblLook w:firstColumn="1" w:firstRow="1" w:lastColumn="0" w:lastRow="0" w:noHBand="0" w:noVBand="1" w:val="04A0"/>
+        <w:tblBorders>
+          <w:top w:val="nil"/>
+          <w:left w:val="nil"/>
+          <w:bottom w:val="nil"/>
+          <w:right w:val="nil"/>
+          <w:insideH w:val="nil"/>
+          <w:insideV w:val="nil"/>
+        </w:tblBorders>
+        <w:tblCellMar>
+          <w:top w:w="0" w:type="dxa"/>
+          <w:start w:w="0" w:type="dxa"/>
+          <w:bottom w:w="0" w:type="dxa"/>
+          <w:end w:w="0" w:type="dxa"/>
+        </w:tblCellMar>
+      </w:tblPr>
+      <w:tblGrid>
+        <w:gridCol w:w="7272"/>
+        <w:gridCol w:w="1944"/>
+      </w:tblGrid>
+      <w:tr>
+        <w:tc>
+          <w:tcPr>
+            <w:tcW w:type="dxa" w:w="7272"/>
+            <w:vAlign w:val="center"/>
+          </w:tcPr>
+          <w:p>
+            <w:pPr>
+              <w:keepNext/>
+              <w:spacing w:before="40" w:after="0"/>
+            </w:pPr>
+            <w:r>
+              <w:rPr>
+                <w:rFonts w:ascii="Aptos" w:hAnsi="Aptos"/>
+                <w:b/>
+                <w:sz w:val="18"/>
+              </w:rPr>
+              <w:t>Evvotec Pte Ltd</w:t>
+            </w:r>
+          </w:p>
+        </w:tc>
+        <w:tc>
+          <w:tcPr>
+            <w:tcW w:type="dxa" w:w="1944"/>
+            <w:vAlign w:val="center"/>
+          </w:tcPr>
+          <w:p>
+            <w:pPr>
+              <w:keepNext/>
+              <w:spacing w:before="40" w:after="0"/>
+              <w:jc w:val="right"/>
+            </w:pPr>
+            <w:r>
+              <w:rPr>
+                <w:rFonts w:ascii="Aptos" w:hAnsi="Aptos"/>
+                <w:b w:val="0"/>
+                <w:color w:val="4C565E"/>
+                <w:sz w:val="18"/>
+              </w:rPr>
+              <w:t>Apr 2015 - Apr 2016</w:t>
+            </w:r>
+          </w:p>
+        </w:tc>
+      </w:tr>
+    </w:tbl>
+    <w:tbl>
+      <w:tblPr>
+        <w:tblW w:type="auto" w:w="0"/>
+        <w:jc w:val="center"/>
+        <w:tblLayout w:type="fixed"/>
+        <w:tblLook w:firstColumn="1" w:firstRow="1" w:lastColumn="0" w:lastRow="0" w:noHBand="0" w:noVBand="1" w:val="04A0"/>
+        <w:tblBorders>
+          <w:top w:val="nil"/>
+          <w:left w:val="nil"/>
+          <w:bottom w:val="nil"/>
+          <w:right w:val="nil"/>
+          <w:insideH w:val="nil"/>
+          <w:insideV w:val="nil"/>
+        </w:tblBorders>
+        <w:tblCellMar>
+          <w:top w:w="0" w:type="dxa"/>
+          <w:start w:w="0" w:type="dxa"/>
+          <w:bottom w:w="0" w:type="dxa"/>
+          <w:end w:w="0" w:type="dxa"/>
+        </w:tblCellMar>
+      </w:tblPr>
+      <w:tblGrid>
+        <w:gridCol w:w="7272"/>
+        <w:gridCol w:w="1944"/>
+      </w:tblGrid>
+      <w:tr>
+        <w:tc>
+          <w:tcPr>
+            <w:tcW w:type="dxa" w:w="7272"/>
+            <w:vAlign w:val="center"/>
+          </w:tcPr>
+          <w:p>
+            <w:pPr>
+              <w:keepNext/>
+              <w:spacing w:before="0" w:after="20"/>
+            </w:pPr>
+            <w:r>
+              <w:rPr>
+                <w:rFonts w:ascii="Aptos" w:hAnsi="Aptos"/>
+                <w:b/>
+                <w:sz w:val="18"/>
+              </w:rPr>
+              <w:t>NOC &amp; IT Support Engineer</w:t>
+            </w:r>
+          </w:p>
+        </w:tc>
+        <w:tc>
+          <w:tcPr>
+            <w:tcW w:type="dxa" w:w="1944"/>
+            <w:vAlign w:val="center"/>
+          </w:tcPr>
+          <w:p>
+            <w:pPr>
+              <w:keepNext/>
+              <w:spacing w:before="0" w:after="20"/>
+              <w:jc w:val="right"/>
+            </w:pPr>
+            <w:r>
+              <w:rPr>
+                <w:rFonts w:ascii="Aptos" w:hAnsi="Aptos"/>
+                <w:b w:val="0"/>
+                <w:color w:val="4C565E"/>
+                <w:sz w:val="18"/>
+              </w:rPr>
+              <w:t>Singapore</w:t>
+            </w:r>
+          </w:p>
+        </w:tc>
+      </w:tr>
+    </w:tbl>
     <w:p>
       <w:pPr>
-        <w:pStyle w:val="ResumeSection"/>
+        <w:pStyle w:val="ListBullet"/>
+        <w:keepNext w:val="0"/>
+      </w:pPr>
+      <w:r>
+        <w:rPr>
+          <w:rFonts w:ascii="Aptos" w:hAnsi="Aptos"/>
+          <w:b w:val="0"/>
+        </w:rPr>
+        <w:t>Network monitoring, incident documentation, and customer infrastructure support.</w:t>
+      </w:r>
+    </w:p>
+    <w:tbl>
+      <w:tblPr>
+        <w:tblW w:type="auto" w:w="0"/>
+        <w:jc w:val="center"/>
+        <w:tblLayout w:type="fixed"/>
+        <w:tblLook w:firstColumn="1" w:firstRow="1" w:lastColumn="0" w:lastRow="0" w:noHBand="0" w:noVBand="1" w:val="04A0"/>
+        <w:tblBorders>
+          <w:top w:val="nil"/>
+          <w:left w:val="nil"/>
+          <w:bottom w:val="nil"/>
+          <w:right w:val="nil"/>
+          <w:insideH w:val="nil"/>
+          <w:insideV w:val="nil"/>
+        </w:tblBorders>
+        <w:tblCellMar>
+          <w:top w:w="0" w:type="dxa"/>
+          <w:start w:w="0" w:type="dxa"/>
+          <w:bottom w:w="0" w:type="dxa"/>
+          <w:end w:w="0" w:type="dxa"/>
+        </w:tblCellMar>
+      </w:tblPr>
+      <w:tblGrid>
+        <w:gridCol w:w="7272"/>
+        <w:gridCol w:w="1944"/>
+      </w:tblGrid>
+      <w:tr>
+        <w:tc>
+          <w:tcPr>
+            <w:tcW w:type="dxa" w:w="7272"/>
+            <w:vAlign w:val="center"/>
+          </w:tcPr>
+          <w:p>
+            <w:pPr>
+              <w:keepNext/>
+              <w:spacing w:before="40" w:after="0"/>
+            </w:pPr>
+            <w:r>
+              <w:rPr>
+                <w:rFonts w:ascii="Aptos" w:hAnsi="Aptos"/>
+                <w:b/>
+                <w:sz w:val="18"/>
+              </w:rPr>
+              <w:t>A-speed Infotech Pte Ltd</w:t>
+            </w:r>
+          </w:p>
+        </w:tc>
+        <w:tc>
+          <w:tcPr>
+            <w:tcW w:type="dxa" w:w="1944"/>
+            <w:vAlign w:val="center"/>
+          </w:tcPr>
+          <w:p>
+            <w:pPr>
+              <w:keepNext/>
+              <w:spacing w:before="40" w:after="0"/>
+              <w:jc w:val="right"/>
+            </w:pPr>
+            <w:r>
+              <w:rPr>
+                <w:rFonts w:ascii="Aptos" w:hAnsi="Aptos"/>
+                <w:b w:val="0"/>
+                <w:color w:val="4C565E"/>
+                <w:sz w:val="18"/>
+              </w:rPr>
+              <w:t>Feb 2014 - Apr 2015</w:t>
+            </w:r>
+          </w:p>
+        </w:tc>
+      </w:tr>
+    </w:tbl>
+    <w:tbl>
+      <w:tblPr>
+        <w:tblW w:type="auto" w:w="0"/>
+        <w:jc w:val="center"/>
+        <w:tblLayout w:type="fixed"/>
+        <w:tblLook w:firstColumn="1" w:firstRow="1" w:lastColumn="0" w:lastRow="0" w:noHBand="0" w:noVBand="1" w:val="04A0"/>
+        <w:tblBorders>
+          <w:top w:val="nil"/>
+          <w:left w:val="nil"/>
+          <w:bottom w:val="nil"/>
+          <w:right w:val="nil"/>
+          <w:insideH w:val="nil"/>
+          <w:insideV w:val="nil"/>
+        </w:tblBorders>
+        <w:tblCellMar>
+          <w:top w:w="0" w:type="dxa"/>
+          <w:start w:w="0" w:type="dxa"/>
+          <w:bottom w:w="0" w:type="dxa"/>
+          <w:end w:w="0" w:type="dxa"/>
+        </w:tblCellMar>
+      </w:tblPr>
+      <w:tblGrid>
+        <w:gridCol w:w="7272"/>
+        <w:gridCol w:w="1944"/>
+      </w:tblGrid>
+      <w:tr>
+        <w:tc>
+          <w:tcPr>
+            <w:tcW w:type="dxa" w:w="7272"/>
+            <w:vAlign w:val="center"/>
+          </w:tcPr>
+          <w:p>
+            <w:pPr>
+              <w:keepNext/>
+              <w:spacing w:before="0" w:after="20"/>
+            </w:pPr>
+            <w:r>
+              <w:rPr>
+                <w:rFonts w:ascii="Aptos" w:hAnsi="Aptos"/>
+                <w:b/>
+                <w:sz w:val="18"/>
+              </w:rPr>
+              <w:t>IT Engineer</w:t>
+            </w:r>
+          </w:p>
+        </w:tc>
+        <w:tc>
+          <w:tcPr>
+            <w:tcW w:type="dxa" w:w="1944"/>
+            <w:vAlign w:val="center"/>
+          </w:tcPr>
+          <w:p>
+            <w:pPr>
+              <w:keepNext/>
+              <w:spacing w:before="0" w:after="20"/>
+              <w:jc w:val="right"/>
+            </w:pPr>
+            <w:r>
+              <w:rPr>
+                <w:rFonts w:ascii="Aptos" w:hAnsi="Aptos"/>
+                <w:b w:val="0"/>
+                <w:color w:val="4C565E"/>
+                <w:sz w:val="18"/>
+              </w:rPr>
+              <w:t>Singapore</w:t>
+            </w:r>
+          </w:p>
+        </w:tc>
+      </w:tr>
+    </w:tbl>
+    <w:p>
+      <w:pPr>
+        <w:pStyle w:val="ListBullet"/>
+        <w:keepNext w:val="0"/>
+      </w:pPr>
+      <w:r>
+        <w:rPr>
+          <w:rFonts w:ascii="Aptos" w:hAnsi="Aptos"/>
+          <w:b w:val="0"/>
+        </w:rPr>
+        <w:t>End-user support, server/network maintenance, and security administration.</w:t>
+      </w:r>
+    </w:p>
+    <w:tbl>
+      <w:tblPr>
+        <w:tblW w:type="auto" w:w="0"/>
+        <w:jc w:val="center"/>
+        <w:tblLayout w:type="fixed"/>
+        <w:tblLook w:firstColumn="1" w:firstRow="1" w:lastColumn="0" w:lastRow="0" w:noHBand="0" w:noVBand="1" w:val="04A0"/>
+        <w:tblBorders>
+          <w:top w:val="nil"/>
+          <w:left w:val="nil"/>
+          <w:bottom w:val="nil"/>
+          <w:right w:val="nil"/>
+          <w:insideH w:val="nil"/>
+          <w:insideV w:val="nil"/>
+        </w:tblBorders>
+        <w:tblCellMar>
+          <w:top w:w="0" w:type="dxa"/>
+          <w:start w:w="0" w:type="dxa"/>
+          <w:bottom w:w="0" w:type="dxa"/>
+          <w:end w:w="0" w:type="dxa"/>
+        </w:tblCellMar>
+      </w:tblPr>
+      <w:tblGrid>
+        <w:gridCol w:w="7272"/>
+        <w:gridCol w:w="1944"/>
+      </w:tblGrid>
+      <w:tr>
+        <w:tc>
+          <w:tcPr>
+            <w:tcW w:type="dxa" w:w="7272"/>
+            <w:vAlign w:val="center"/>
+          </w:tcPr>
+          <w:p>
+            <w:pPr>
+              <w:keepNext/>
+              <w:spacing w:before="40" w:after="0"/>
+            </w:pPr>
+            <w:r>
+              <w:rPr>
+                <w:rFonts w:ascii="Aptos" w:hAnsi="Aptos"/>
+                <w:b/>
+                <w:sz w:val="18"/>
+              </w:rPr>
+              <w:t>NCS</w:t>
+            </w:r>
+          </w:p>
+        </w:tc>
+        <w:tc>
+          <w:tcPr>
+            <w:tcW w:type="dxa" w:w="1944"/>
+            <w:vAlign w:val="center"/>
+          </w:tcPr>
+          <w:p>
+            <w:pPr>
+              <w:keepNext/>
+              <w:spacing w:before="40" w:after="0"/>
+              <w:jc w:val="right"/>
+            </w:pPr>
+            <w:r>
+              <w:rPr>
+                <w:rFonts w:ascii="Aptos" w:hAnsi="Aptos"/>
+                <w:b w:val="0"/>
+                <w:color w:val="4C565E"/>
+                <w:sz w:val="18"/>
+              </w:rPr>
+              <w:t>June 2010 - January 2014</w:t>
+            </w:r>
+          </w:p>
+        </w:tc>
+      </w:tr>
+    </w:tbl>
+    <w:tbl>
+      <w:tblPr>
+        <w:tblW w:type="auto" w:w="0"/>
+        <w:jc w:val="center"/>
+        <w:tblLayout w:type="fixed"/>
+        <w:tblLook w:firstColumn="1" w:firstRow="1" w:lastColumn="0" w:lastRow="0" w:noHBand="0" w:noVBand="1" w:val="04A0"/>
+        <w:tblBorders>
+          <w:top w:val="nil"/>
+          <w:left w:val="nil"/>
+          <w:bottom w:val="nil"/>
+          <w:right w:val="nil"/>
+          <w:insideH w:val="nil"/>
+          <w:insideV w:val="nil"/>
+        </w:tblBorders>
+        <w:tblCellMar>
+          <w:top w:w="0" w:type="dxa"/>
+          <w:start w:w="0" w:type="dxa"/>
+          <w:bottom w:w="0" w:type="dxa"/>
+          <w:end w:w="0" w:type="dxa"/>
+        </w:tblCellMar>
+      </w:tblPr>
+      <w:tblGrid>
+        <w:gridCol w:w="7272"/>
+        <w:gridCol w:w="1944"/>
+      </w:tblGrid>
+      <w:tr>
+        <w:tc>
+          <w:tcPr>
+            <w:tcW w:type="dxa" w:w="7272"/>
+            <w:vAlign w:val="center"/>
+          </w:tcPr>
+          <w:p>
+            <w:pPr>
+              <w:keepNext/>
+              <w:spacing w:before="0" w:after="20"/>
+            </w:pPr>
+            <w:r>
+              <w:rPr>
+                <w:rFonts w:ascii="Aptos" w:hAnsi="Aptos"/>
+                <w:b/>
+                <w:sz w:val="18"/>
+              </w:rPr>
+              <w:t>SSOE IT Support Engineer, MOE SSOE Project</w:t>
+            </w:r>
+          </w:p>
+        </w:tc>
+        <w:tc>
+          <w:tcPr>
+            <w:tcW w:type="dxa" w:w="1944"/>
+            <w:vAlign w:val="center"/>
+          </w:tcPr>
+          <w:p>
+            <w:pPr>
+              <w:keepNext/>
+              <w:spacing w:before="0" w:after="20"/>
+              <w:jc w:val="right"/>
+            </w:pPr>
+            <w:r>
+              <w:rPr>
+                <w:rFonts w:ascii="Aptos" w:hAnsi="Aptos"/>
+                <w:b w:val="0"/>
+                <w:color w:val="4C565E"/>
+                <w:sz w:val="18"/>
+              </w:rPr>
+              <w:t>Singapore</w:t>
+            </w:r>
+          </w:p>
+        </w:tc>
+      </w:tr>
+    </w:tbl>
+    <w:p>
+      <w:pPr>
+        <w:pStyle w:val="ListBullet"/>
         <w:keepNext/>
       </w:pPr>
       <w:r>
         <w:rPr>
-          <w:rFonts w:ascii="Calibri" w:hAnsi="Calibri"/>
-          <w:b/>
-          <w:color w:val="227D91"/>
-          <w:sz w:val="21"/>
-        </w:rPr>
-        <w:t>EARLIER EXPERIENCE</w:t>
-      </w:r>
-    </w:p>
-    <w:p>
-      <w:pPr>
-        <w:pStyle w:val="ListBullet"/>
-        <w:widowControl/>
-        <w:spacing w:before="0" w:after="66" w:line="257" w:lineRule="auto"/>
-        <w:ind w:left="288" w:hanging="202"/>
-      </w:pPr>
-      <w:r>
-        <w:rPr>
-          <w:rFonts w:ascii="Calibri" w:hAnsi="Calibri"/>
-          <w:color w:val="22282D"/>
-          <w:sz w:val="20"/>
-        </w:rPr>
-        <w:t>NOC &amp; IT Support Engineer | Evvotec Pte Ltd | Apr 2015 - Apr 2016 - Network monitoring, incident documentation, and customer infrastructure support.</w:t>
-      </w:r>
-    </w:p>
-    <w:p>
-      <w:pPr>
-        <w:pStyle w:val="ListBullet"/>
-        <w:widowControl/>
-        <w:spacing w:before="0" w:after="66" w:line="257" w:lineRule="auto"/>
-        <w:ind w:left="288" w:hanging="202"/>
-      </w:pPr>
-      <w:r>
-        <w:rPr>
-          <w:rFonts w:ascii="Calibri" w:hAnsi="Calibri"/>
-          <w:color w:val="22282D"/>
-          <w:sz w:val="20"/>
-        </w:rPr>
-        <w:t>IT Engineer | A-speed Infotech Pte Ltd | Feb 2014 - Apr 2015 - End-user support, server/network maintenance, and security administration.</w:t>
-      </w:r>
-    </w:p>
-    <w:p>
-      <w:pPr>
-        <w:keepNext/>
-        <w:spacing w:before="60" w:after="0"/>
-      </w:pPr>
-      <w:r>
-        <w:rPr>
-          <w:rFonts w:ascii="Calibri" w:hAnsi="Calibri"/>
-          <w:b/>
-          <w:color w:val="14364A"/>
-          <w:sz w:val="22"/>
-        </w:rPr>
-        <w:t>SSOE IT Support Engineer, MOE SSOE Project</w:t>
-      </w:r>
-    </w:p>
-    <w:p>
-      <w:pPr>
-        <w:keepNext/>
-        <w:spacing w:after="60"/>
-      </w:pPr>
-      <w:r>
-        <w:rPr>
-          <w:rFonts w:ascii="Calibri" w:hAnsi="Calibri"/>
-          <w:b/>
-          <w:color w:val="525D65"/>
-          <w:sz w:val="19"/>
-        </w:rPr>
-        <w:t>NCS | Singapore | June 2010 - January 2014</w:t>
-      </w:r>
-    </w:p>
-    <w:p>
-      <w:pPr>
-        <w:pStyle w:val="ListBullet"/>
-        <w:widowControl/>
-        <w:spacing w:before="0" w:after="66" w:line="257" w:lineRule="auto"/>
-        <w:ind w:left="288" w:hanging="202"/>
-      </w:pPr>
-      <w:r>
-        <w:rPr>
-          <w:rFonts w:ascii="Calibri" w:hAnsi="Calibri"/>
-          <w:color w:val="22282D"/>
-          <w:sz w:val="20"/>
+          <w:rFonts w:ascii="Aptos" w:hAnsi="Aptos"/>
+          <w:b w:val="0"/>
         </w:rPr>
         <w:t>Provided school ICT and desktop support, troubleshooting end-user hardware and software issues and handling support tickets.</w:t>
       </w:r>
@@ -688,225 +1204,394 @@
       <w:pPr>
         <w:pStyle w:val="ListBullet"/>
         <w:keepNext w:val="0"/>
-        <w:widowControl/>
-        <w:spacing w:before="0" w:after="66" w:line="257" w:lineRule="auto"/>
-        <w:ind w:left="288" w:hanging="202"/>
       </w:pPr>
       <w:r>
         <w:rPr>
-          <w:rFonts w:ascii="Calibri" w:hAnsi="Calibri"/>
-          <w:color w:val="22282D"/>
-          <w:sz w:val="20"/>
+          <w:rFonts w:ascii="Aptos" w:hAnsi="Aptos"/>
+          <w:b w:val="0"/>
         </w:rPr>
         <w:t>Installed and patched software, maintained IT asset inventory, and coordinated with vendors on repairs and replacements.</w:t>
       </w:r>
     </w:p>
     <w:p>
       <w:pPr>
-        <w:pStyle w:val="ResumeSection"/>
+        <w:pStyle w:val="Heading1"/>
         <w:keepNext/>
       </w:pPr>
       <w:r>
+        <w:t>Certification</w:t>
+      </w:r>
+    </w:p>
+    <w:p>
+      <w:pPr>
+        <w:pStyle w:val="ListBullet"/>
+        <w:keepNext w:val="0"/>
+      </w:pPr>
+      <w:r>
         <w:rPr>
-          <w:rFonts w:ascii="Calibri" w:hAnsi="Calibri"/>
-          <w:b/>
-          <w:color w:val="227D91"/>
-          <w:sz w:val="21"/>
+          <w:rFonts w:ascii="Aptos" w:hAnsi="Aptos"/>
+          <w:b w:val="0"/>
         </w:rPr>
-        <w:t>SELECTED PROJECT</w:t>
+        <w:t>Splunk Enterprise Certified Admin | 2026</w:t>
+      </w:r>
+    </w:p>
+    <w:p>
+      <w:pPr>
+        <w:pStyle w:val="ListBullet"/>
+        <w:keepNext w:val="0"/>
+      </w:pPr>
+      <w:r>
+        <w:rPr>
+          <w:rFonts w:ascii="Aptos" w:hAnsi="Aptos"/>
+          <w:b w:val="0"/>
+        </w:rPr>
+        <w:t>Splunk Core Certified Power User | 2025</w:t>
+      </w:r>
+    </w:p>
+    <w:p>
+      <w:pPr>
+        <w:pStyle w:val="Heading1"/>
+        <w:keepNext/>
+      </w:pPr>
+      <w:r>
+        <w:t>Education</w:t>
+      </w:r>
+    </w:p>
+    <w:tbl>
+      <w:tblPr>
+        <w:tblW w:type="auto" w:w="0"/>
+        <w:jc w:val="center"/>
+        <w:tblLayout w:type="fixed"/>
+        <w:tblLook w:firstColumn="1" w:firstRow="1" w:lastColumn="0" w:lastRow="0" w:noHBand="0" w:noVBand="1" w:val="04A0"/>
+        <w:tblBorders>
+          <w:top w:val="nil"/>
+          <w:left w:val="nil"/>
+          <w:bottom w:val="nil"/>
+          <w:right w:val="nil"/>
+          <w:insideH w:val="nil"/>
+          <w:insideV w:val="nil"/>
+        </w:tblBorders>
+        <w:tblCellMar>
+          <w:top w:w="0" w:type="dxa"/>
+          <w:start w:w="0" w:type="dxa"/>
+          <w:bottom w:w="0" w:type="dxa"/>
+          <w:end w:w="0" w:type="dxa"/>
+        </w:tblCellMar>
+      </w:tblPr>
+      <w:tblGrid>
+        <w:gridCol w:w="7272"/>
+        <w:gridCol w:w="1944"/>
+      </w:tblGrid>
+      <w:tr>
+        <w:tc>
+          <w:tcPr>
+            <w:tcW w:type="dxa" w:w="7272"/>
+            <w:vAlign w:val="center"/>
+          </w:tcPr>
+          <w:p>
+            <w:pPr>
+              <w:keepNext/>
+              <w:spacing w:before="40" w:after="0"/>
+            </w:pPr>
+            <w:r>
+              <w:rPr>
+                <w:rFonts w:ascii="Aptos" w:hAnsi="Aptos"/>
+                <w:b/>
+                <w:sz w:val="18"/>
+              </w:rPr>
+              <w:t>University of Portsmouth</w:t>
+            </w:r>
+          </w:p>
+        </w:tc>
+        <w:tc>
+          <w:tcPr>
+            <w:tcW w:type="dxa" w:w="1944"/>
+            <w:vAlign w:val="center"/>
+          </w:tcPr>
+          <w:p>
+            <w:pPr>
+              <w:keepNext/>
+              <w:spacing w:before="40" w:after="0"/>
+              <w:jc w:val="right"/>
+            </w:pPr>
+            <w:r>
+              <w:rPr>
+                <w:rFonts w:ascii="Aptos" w:hAnsi="Aptos"/>
+                <w:b w:val="0"/>
+                <w:color w:val="4C565E"/>
+                <w:sz w:val="18"/>
+              </w:rPr>
+              <w:t>2022</w:t>
+            </w:r>
+          </w:p>
+        </w:tc>
+      </w:tr>
+    </w:tbl>
+    <w:tbl>
+      <w:tblPr>
+        <w:tblW w:type="auto" w:w="0"/>
+        <w:jc w:val="center"/>
+        <w:tblLayout w:type="fixed"/>
+        <w:tblLook w:firstColumn="1" w:firstRow="1" w:lastColumn="0" w:lastRow="0" w:noHBand="0" w:noVBand="1" w:val="04A0"/>
+        <w:tblBorders>
+          <w:top w:val="nil"/>
+          <w:left w:val="nil"/>
+          <w:bottom w:val="nil"/>
+          <w:right w:val="nil"/>
+          <w:insideH w:val="nil"/>
+          <w:insideV w:val="nil"/>
+        </w:tblBorders>
+        <w:tblCellMar>
+          <w:top w:w="0" w:type="dxa"/>
+          <w:start w:w="0" w:type="dxa"/>
+          <w:bottom w:w="0" w:type="dxa"/>
+          <w:end w:w="0" w:type="dxa"/>
+        </w:tblCellMar>
+      </w:tblPr>
+      <w:tblGrid>
+        <w:gridCol w:w="7272"/>
+        <w:gridCol w:w="1944"/>
+      </w:tblGrid>
+      <w:tr>
+        <w:tc>
+          <w:tcPr>
+            <w:tcW w:type="dxa" w:w="7272"/>
+            <w:vAlign w:val="center"/>
+          </w:tcPr>
+          <w:p>
+            <w:pPr>
+              <w:keepNext/>
+              <w:spacing w:before="0" w:after="0"/>
+            </w:pPr>
+            <w:r>
+              <w:rPr>
+                <w:rFonts w:ascii="Aptos" w:hAnsi="Aptos"/>
+                <w:b w:val="0"/>
+                <w:sz w:val="18"/>
+              </w:rPr>
+              <w:t>Bachelor's Degree, Computer Science / Information Technology (Cybersecurity &amp; Forensics Computing)</w:t>
+            </w:r>
+          </w:p>
+        </w:tc>
+        <w:tc>
+          <w:tcPr>
+            <w:tcW w:type="dxa" w:w="1944"/>
+            <w:vAlign w:val="center"/>
+          </w:tcPr>
+          <w:p>
+            <w:pPr>
+              <w:keepNext/>
+              <w:spacing w:before="0" w:after="0"/>
+              <w:jc w:val="right"/>
+            </w:pPr>
+            <w:r>
+              <w:rPr>
+                <w:rFonts w:ascii="Aptos" w:hAnsi="Aptos"/>
+                <w:b w:val="0"/>
+                <w:color w:val="4C565E"/>
+                <w:sz w:val="18"/>
+              </w:rPr>
+              <w:t>United Kingdom</w:t>
+            </w:r>
+          </w:p>
+        </w:tc>
+      </w:tr>
+    </w:tbl>
+    <w:p>
+      <w:pPr>
+        <w:pStyle w:val="ListBullet"/>
+        <w:keepNext w:val="0"/>
+      </w:pPr>
+      <w:r>
+        <w:rPr>
+          <w:rFonts w:ascii="Aptos" w:hAnsi="Aptos"/>
+          <w:b w:val="0"/>
+        </w:rPr>
+        <w:t>Achievements: Second Class Honours (Upper Division)</w:t>
+      </w:r>
+    </w:p>
+    <w:tbl>
+      <w:tblPr>
+        <w:tblW w:type="auto" w:w="0"/>
+        <w:jc w:val="center"/>
+        <w:tblLayout w:type="fixed"/>
+        <w:tblLook w:firstColumn="1" w:firstRow="1" w:lastColumn="0" w:lastRow="0" w:noHBand="0" w:noVBand="1" w:val="04A0"/>
+        <w:tblBorders>
+          <w:top w:val="nil"/>
+          <w:left w:val="nil"/>
+          <w:bottom w:val="nil"/>
+          <w:right w:val="nil"/>
+          <w:insideH w:val="nil"/>
+          <w:insideV w:val="nil"/>
+        </w:tblBorders>
+        <w:tblCellMar>
+          <w:top w:w="0" w:type="dxa"/>
+          <w:start w:w="0" w:type="dxa"/>
+          <w:bottom w:w="0" w:type="dxa"/>
+          <w:end w:w="0" w:type="dxa"/>
+        </w:tblCellMar>
+      </w:tblPr>
+      <w:tblGrid>
+        <w:gridCol w:w="7272"/>
+        <w:gridCol w:w="1944"/>
+      </w:tblGrid>
+      <w:tr>
+        <w:tc>
+          <w:tcPr>
+            <w:tcW w:type="dxa" w:w="7272"/>
+            <w:vAlign w:val="center"/>
+          </w:tcPr>
+          <w:p>
+            <w:pPr>
+              <w:keepNext/>
+              <w:spacing w:before="40" w:after="0"/>
+            </w:pPr>
+            <w:r>
+              <w:rPr>
+                <w:rFonts w:ascii="Aptos" w:hAnsi="Aptos"/>
+                <w:b/>
+                <w:sz w:val="18"/>
+              </w:rPr>
+              <w:t>MAD School (previously Chats Worth Mediation Academy)</w:t>
+            </w:r>
+          </w:p>
+        </w:tc>
+        <w:tc>
+          <w:tcPr>
+            <w:tcW w:type="dxa" w:w="1944"/>
+            <w:vAlign w:val="center"/>
+          </w:tcPr>
+          <w:p>
+            <w:pPr>
+              <w:keepNext/>
+              <w:spacing w:before="40" w:after="0"/>
+              <w:jc w:val="right"/>
+            </w:pPr>
+            <w:r>
+              <w:rPr>
+                <w:rFonts w:ascii="Aptos" w:hAnsi="Aptos"/>
+                <w:b w:val="0"/>
+                <w:color w:val="4C565E"/>
+                <w:sz w:val="18"/>
+              </w:rPr>
+              <w:t>2013</w:t>
+            </w:r>
+          </w:p>
+        </w:tc>
+      </w:tr>
+    </w:tbl>
+    <w:tbl>
+      <w:tblPr>
+        <w:tblW w:type="auto" w:w="0"/>
+        <w:jc w:val="center"/>
+        <w:tblLayout w:type="fixed"/>
+        <w:tblLook w:firstColumn="1" w:firstRow="1" w:lastColumn="0" w:lastRow="0" w:noHBand="0" w:noVBand="1" w:val="04A0"/>
+        <w:tblBorders>
+          <w:top w:val="nil"/>
+          <w:left w:val="nil"/>
+          <w:bottom w:val="nil"/>
+          <w:right w:val="nil"/>
+          <w:insideH w:val="nil"/>
+          <w:insideV w:val="nil"/>
+        </w:tblBorders>
+        <w:tblCellMar>
+          <w:top w:w="0" w:type="dxa"/>
+          <w:start w:w="0" w:type="dxa"/>
+          <w:bottom w:w="0" w:type="dxa"/>
+          <w:end w:w="0" w:type="dxa"/>
+        </w:tblCellMar>
+      </w:tblPr>
+      <w:tblGrid>
+        <w:gridCol w:w="7272"/>
+        <w:gridCol w:w="1944"/>
+      </w:tblGrid>
+      <w:tr>
+        <w:tc>
+          <w:tcPr>
+            <w:tcW w:type="dxa" w:w="7272"/>
+            <w:vAlign w:val="center"/>
+          </w:tcPr>
+          <w:p>
+            <w:pPr>
+              <w:keepNext/>
+              <w:spacing w:before="0" w:after="0"/>
+            </w:pPr>
+            <w:r>
+              <w:rPr>
+                <w:rFonts w:ascii="Aptos" w:hAnsi="Aptos"/>
+                <w:b w:val="0"/>
+                <w:sz w:val="18"/>
+              </w:rPr>
+              <w:t>Diploma, Mass Communications (Communications &amp; Design)</w:t>
+            </w:r>
+          </w:p>
+        </w:tc>
+        <w:tc>
+          <w:tcPr>
+            <w:tcW w:type="dxa" w:w="1944"/>
+            <w:vAlign w:val="center"/>
+          </w:tcPr>
+          <w:p>
+            <w:pPr>
+              <w:keepNext/>
+              <w:spacing w:before="0" w:after="0"/>
+              <w:jc w:val="right"/>
+            </w:pPr>
+            <w:r>
+              <w:rPr>
+                <w:rFonts w:ascii="Aptos" w:hAnsi="Aptos"/>
+                <w:b w:val="0"/>
+                <w:color w:val="4C565E"/>
+                <w:sz w:val="18"/>
+              </w:rPr>
+              <w:t>Singapore</w:t>
+            </w:r>
+          </w:p>
+        </w:tc>
+      </w:tr>
+    </w:tbl>
+    <w:p>
+      <w:pPr>
+        <w:pStyle w:val="Heading1"/>
+        <w:keepNext/>
+      </w:pPr>
+      <w:r>
+        <w:t>Additional Training</w:t>
       </w:r>
     </w:p>
     <w:p>
       <w:pPr>
         <w:keepNext/>
-        <w:spacing w:after="20"/>
       </w:pPr>
       <w:r>
         <w:rPr>
-          <w:rFonts w:ascii="Calibri" w:hAnsi="Calibri"/>
-          <w:b/>
-          <w:color w:val="14364A"/>
-          <w:sz w:val="20"/>
+          <w:rFonts w:ascii="Aptos" w:hAnsi="Aptos"/>
+          <w:b w:val="0"/>
         </w:rPr>
-        <w:t>Splunk Utility Tool 4.0 | Python, Tkinter, Splunk Management API | 2026</w:t>
+        <w:t>Data Science Course - Vertical Institute, Singapore</w:t>
       </w:r>
     </w:p>
     <w:p>
       <w:pPr>
         <w:pStyle w:val="ListBullet"/>
-        <w:widowControl/>
-        <w:spacing w:before="0" w:after="66" w:line="257" w:lineRule="auto"/>
-        <w:ind w:left="288" w:hanging="202"/>
+        <w:keepNext w:val="0"/>
       </w:pPr>
       <w:r>
         <w:rPr>
-          <w:rFonts w:ascii="Calibri" w:hAnsi="Calibri"/>
-          <w:color w:val="22282D"/>
-          <w:sz w:val="20"/>
+          <w:rFonts w:ascii="Aptos" w:hAnsi="Aptos"/>
+          <w:b w:val="0"/>
         </w:rPr>
-        <w:t>Built a public, sanitized Windows desktop utility for controlled Splunk saved-search regeneration with custom and sliced date-range dispatch planning.</w:t>
-      </w:r>
-    </w:p>
-    <w:p>
-      <w:pPr>
-        <w:pStyle w:val="ListBullet"/>
-        <w:widowControl/>
-        <w:spacing w:before="0" w:after="66" w:line="257" w:lineRule="auto"/>
-        <w:ind w:left="288" w:hanging="202"/>
-      </w:pPr>
-      <w:r>
-        <w:rPr>
-          <w:rFonts w:ascii="Calibri" w:hAnsi="Calibri"/>
-          <w:color w:val="22282D"/>
-          <w:sz w:val="20"/>
-        </w:rPr>
-        <w:t>Implemented pre-dispatch review, bounded retry and reconciliation, post-dispatch verification, and tested Plane/Bus execution paths for small and larger workloads.</w:t>
-      </w:r>
-    </w:p>
-    <w:p>
-      <w:pPr>
-        <w:spacing w:after="40"/>
-      </w:pPr>
-      <w:r>
-        <w:rPr>
-          <w:rFonts w:ascii="Calibri" w:hAnsi="Calibri"/>
-          <w:b/>
-          <w:color w:val="525D65"/>
-          <w:sz w:val="18"/>
-        </w:rPr>
-        <w:t xml:space="preserve">Source: </w:t>
-      </w:r>
-      <w:hyperlink r:id="rId14">
-        <w:r>
-          <w:rPr>
-            <w:rFonts w:ascii="Calibri" w:hAnsi="Calibri"/>
-            <w:color w:val="14668C"/>
-            <w:u w:val="single"/>
-            <w:sz w:val="18"/>
-          </w:rPr>
-          <w:t>github.com/skyredt/splunk-utility-tool</w:t>
-        </w:r>
-      </w:hyperlink>
-    </w:p>
-    <w:p>
-      <w:pPr>
-        <w:pStyle w:val="ResumeSection"/>
-        <w:keepNext/>
-      </w:pPr>
-      <w:r>
-        <w:rPr>
-          <w:rFonts w:ascii="Calibri" w:hAnsi="Calibri"/>
-          <w:b/>
-          <w:color w:val="227D91"/>
-          <w:sz w:val="21"/>
-        </w:rPr>
-        <w:t>EDUCATION &amp; TRAINING</w:t>
-      </w:r>
-    </w:p>
-    <w:p>
-      <w:pPr>
-        <w:pStyle w:val="ListBullet"/>
-        <w:widowControl/>
-        <w:spacing w:before="0" w:after="66" w:line="257" w:lineRule="auto"/>
-        <w:ind w:left="288" w:hanging="202"/>
-      </w:pPr>
-      <w:r>
-        <w:rPr>
-          <w:rFonts w:ascii="Calibri" w:hAnsi="Calibri"/>
-          <w:color w:val="22282D"/>
-          <w:sz w:val="20"/>
-        </w:rPr>
-        <w:t>Bachelor's Degree in Computer Science / Information Technology (Cybersecurity &amp; Forensics Computing) | University of Portsmouth, United Kingdom | 2022</w:t>
-      </w:r>
-    </w:p>
-    <w:p>
-      <w:pPr>
-        <w:pStyle w:val="ListBullet"/>
-        <w:widowControl/>
-        <w:spacing w:before="0" w:after="66" w:line="257" w:lineRule="auto"/>
-        <w:ind w:left="288" w:hanging="202"/>
-      </w:pPr>
-      <w:r>
-        <w:rPr>
-          <w:rFonts w:ascii="Calibri" w:hAnsi="Calibri"/>
-          <w:color w:val="22282D"/>
-          <w:sz w:val="20"/>
-        </w:rPr>
-        <w:t>Second Class Honours (Upper Division)</w:t>
-      </w:r>
-    </w:p>
-    <w:p>
-      <w:pPr>
-        <w:pStyle w:val="ListBullet"/>
-        <w:widowControl/>
-        <w:spacing w:before="0" w:after="66" w:line="257" w:lineRule="auto"/>
-        <w:ind w:left="288" w:hanging="202"/>
-      </w:pPr>
-      <w:r>
-        <w:rPr>
-          <w:rFonts w:ascii="Calibri" w:hAnsi="Calibri"/>
-          <w:color w:val="22282D"/>
-          <w:sz w:val="20"/>
-        </w:rPr>
-        <w:t>Data Science Course | Vertical Institute, Singapore - Data Analytics with Python, Data Science with Python, and Machine Learning</w:t>
-      </w:r>
-    </w:p>
-    <w:p>
-      <w:pPr>
-        <w:pStyle w:val="ListBullet"/>
-        <w:widowControl/>
-        <w:spacing w:before="0" w:after="66" w:line="257" w:lineRule="auto"/>
-        <w:ind w:left="288" w:hanging="202"/>
-      </w:pPr>
-      <w:r>
-        <w:rPr>
-          <w:rFonts w:ascii="Calibri" w:hAnsi="Calibri"/>
-          <w:color w:val="22282D"/>
-          <w:sz w:val="20"/>
-        </w:rPr>
-        <w:t>Diploma in Mass Communications (Communications &amp; Design) | MAD School, Singapore | 2013</w:t>
+        <w:t>Modules: Data Analytics with Python; Data Science with Python; Machine Learning</w:t>
       </w:r>
     </w:p>
     <w:sectPr>
-      <w:footerReference w:type="default" r:id="rId9"/>
-      <w:pgSz w:w="11906" w:h="16838"/>
-      <w:pgMar w:top="763" w:right="893" w:bottom="720" w:left="893" w:header="360" w:footer="360" w:gutter="0"/>
+      <w:pgSz w:w="12240" w:h="15840"/>
+      <w:pgMar w:top="792" w:right="893" w:bottom="648" w:left="893" w:header="720" w:footer="720" w:gutter="0"/>
       <w:cols w:space="720"/>
       <w:docGrid w:linePitch="360"/>
     </w:sectPr>
   </w:body>
 </w:document>
-</file>
-
-<file path=word/footer1.xml><?xml version="1.0" encoding="utf-8"?>
-<w:ftr xmlns:m="http://schemas.openxmlformats.org/officeDocument/2006/math" xmlns:mc="http://schemas.openxmlformats.org/markup-compatibility/2006" xmlns:mo="http://schemas.microsoft.com/office/mac/office/2008/main" xmlns:mv="urn:schemas-microsoft-com:mac:vml" xmlns:o="urn:schemas-microsoft-com:office:office" xmlns:r="http://schemas.openxmlformats.org/officeDocument/2006/relationships" xmlns:v="urn:schemas-microsoft-com:vml" xmlns:w10="urn:schemas-microsoft-com:office:word" xmlns:w14="http://schemas.microsoft.com/office/word/2010/wordml" xmlns:w="http://schemas.openxmlformats.org/wordprocessingml/2006/main" xmlns:wne="http://schemas.microsoft.com/office/word/2006/wordml" xmlns:wp14="http://schemas.microsoft.com/office/word/2010/wordprocessingDrawing" xmlns:wp="http://schemas.openxmlformats.org/drawingml/2006/wordprocessingDrawing" xmlns:wpc="http://schemas.microsoft.com/office/word/2010/wordprocessingCanvas" xmlns:wpg="http://schemas.microsoft.com/office/word/2010/wordprocessingGroup" xmlns:wpi="http://schemas.microsoft.com/office/word/2010/wordprocessingInk" xmlns:wps="http://schemas.microsoft.com/office/word/2010/wordprocessingShape" mc:Ignorable="w14 wp14">
-  <w:p>
-    <w:pPr>
-      <w:pStyle w:val="Footer"/>
-      <w:spacing w:before="0" w:after="0"/>
-      <w:jc w:val="right"/>
-    </w:pPr>
-    <w:r>
-      <w:rPr>
-        <w:rFonts w:ascii="Calibri" w:hAnsi="Calibri"/>
-        <w:color w:val="525D65"/>
-        <w:sz w:val="17"/>
-      </w:rPr>
-      <w:t xml:space="preserve">Page </w:t>
-    </w:r>
-    <w:r>
-      <w:rPr>
-        <w:color w:val="525D65"/>
-        <w:sz w:val="17"/>
-      </w:rPr>
-      <w:fldChar w:fldCharType="begin"/>
-      <w:instrText xml:space="preserve"> PAGE </w:instrText>
-      <w:fldChar w:fldCharType="separate"/>
-      <w:t>1</w:t>
-      <w:fldChar w:fldCharType="end"/>
-    </w:r>
-  </w:p>
-</w:ftr>
 </file>
 
 <file path=word/numbering.xml><?xml version="1.0" encoding="utf-8"?>
@@ -1273,13 +1958,12 @@
     <w:qFormat/>
     <w:rsid w:val="00FC693F"/>
     <w:pPr>
-      <w:widowControl/>
-      <w:spacing w:before="0" w:after="80" w:line="257" w:lineRule="auto"/>
+      <w:spacing w:after="50" w:line="259" w:lineRule="auto"/>
     </w:pPr>
     <w:rPr>
-      <w:rFonts w:ascii="Calibri" w:hAnsi="Calibri"/>
-      <w:color w:val="22282D"/>
-      <w:sz w:val="20"/>
+      <w:rFonts w:ascii="Aptos" w:hAnsi="Aptos"/>
+      <w:color w:val="23272B"/>
+      <w:sz w:val="18"/>
     </w:rPr>
   </w:style>
   <w:style w:type="paragraph" w:styleId="Header">
@@ -1337,15 +2021,15 @@
     <w:pPr>
       <w:keepNext/>
       <w:keepLines/>
-      <w:spacing w:before="480" w:after="0"/>
+      <w:spacing w:before="160" w:after="100"/>
       <w:outlineLvl w:val="0"/>
     </w:pPr>
     <w:rPr>
-      <w:rFonts w:asciiTheme="majorHAnsi" w:eastAsiaTheme="majorEastAsia" w:hAnsiTheme="majorHAnsi" w:cstheme="majorBidi"/>
+      <w:rFonts w:asciiTheme="majorHAnsi" w:eastAsiaTheme="majorEastAsia" w:hAnsiTheme="majorHAnsi" w:cstheme="majorBidi" w:ascii="Aptos" w:hAnsi="Aptos"/>
       <w:b/>
       <w:bCs/>
-      <w:color w:val="365F91" w:themeColor="accent1" w:themeShade="BF"/>
-      <w:sz w:val="28"/>
+      <w:color w:val="106070"/>
+      <w:sz w:val="20"/>
       <w:szCs w:val="28"/>
     </w:rPr>
   </w:style>
@@ -1361,15 +2045,15 @@
     <w:pPr>
       <w:keepNext/>
       <w:keepLines/>
-      <w:spacing w:before="200" w:after="0"/>
+      <w:spacing w:before="80" w:after="20"/>
       <w:outlineLvl w:val="1"/>
     </w:pPr>
     <w:rPr>
-      <w:rFonts w:asciiTheme="majorHAnsi" w:eastAsiaTheme="majorEastAsia" w:hAnsiTheme="majorHAnsi" w:cstheme="majorBidi"/>
+      <w:rFonts w:asciiTheme="majorHAnsi" w:eastAsiaTheme="majorEastAsia" w:hAnsiTheme="majorHAnsi" w:cstheme="majorBidi" w:ascii="Aptos" w:hAnsi="Aptos"/>
       <w:b/>
       <w:bCs/>
-      <w:color w:val="4F81BD" w:themeColor="accent1"/>
-      <w:sz w:val="26"/>
+      <w:color w:val="23272B"/>
+      <w:sz w:val="21"/>
       <w:szCs w:val="26"/>
     </w:rPr>
   </w:style>
@@ -1630,11 +2314,12 @@
       <w:contextualSpacing/>
     </w:pPr>
     <w:rPr>
-      <w:rFonts w:asciiTheme="majorHAnsi" w:eastAsiaTheme="majorEastAsia" w:hAnsiTheme="majorHAnsi" w:cstheme="majorBidi"/>
-      <w:color w:val="17365D" w:themeColor="text2" w:themeShade="BF"/>
+      <w:rFonts w:asciiTheme="majorHAnsi" w:eastAsiaTheme="majorEastAsia" w:hAnsiTheme="majorHAnsi" w:cstheme="majorBidi" w:ascii="Aptos" w:hAnsi="Aptos"/>
+      <w:b/>
+      <w:color w:val="23272B"/>
       <w:spacing w:val="5"/>
       <w:kern w:val="28"/>
-      <w:sz w:val="52"/>
+      <w:sz w:val="48"/>
       <w:szCs w:val="52"/>
     </w:rPr>
   </w:style>
@@ -1808,11 +2493,14 @@
       <w:numPr>
         <w:numId w:val="1"/>
       </w:numPr>
+      <w:spacing w:after="30" w:line="250" w:lineRule="auto"/>
+      <w:ind w:left="317" w:hanging="173"/>
       <w:contextualSpacing/>
     </w:pPr>
     <w:rPr>
-      <w:rFonts w:ascii="Calibri" w:hAnsi="Calibri"/>
-      <w:sz w:val="20"/>
+      <w:rFonts w:ascii="Aptos" w:hAnsi="Aptos"/>
+      <w:color w:val="23272B"/>
+      <w:sz w:val="17"/>
     </w:rPr>
   </w:style>
   <w:style w:type="paragraph" w:styleId="ListBullet2">
@@ -12967,19 +13655,6 @@
         <w:shd w:val="clear" w:color="auto" w:fill="FBCAA2" w:themeFill="accent6" w:themeFillTint="7F"/>
       </w:tcPr>
     </w:tblStylePr>
-  </w:style>
-  <w:style w:type="paragraph" w:customStyle="1" w:styleId="ResumeSection">
-    <w:name w:val="Resume Section"/>
-    <w:pPr>
-      <w:keepNext/>
-      <w:spacing w:before="180" w:after="80"/>
-    </w:pPr>
-    <w:rPr>
-      <w:rFonts w:ascii="Calibri" w:hAnsi="Calibri"/>
-      <w:b/>
-      <w:color w:val="227D91"/>
-      <w:sz w:val="22"/>
-    </w:rPr>
   </w:style>
 </w:styles>
 </file>

</xml_diff>